<commit_message>
add docs and update project
</commit_message>
<xml_diff>
--- a/src/SpringFramework/ORM/ORM.docx
+++ b/src/SpringFramework/ORM/ORM.docx
@@ -31,30 +31,7 @@
           <w:b/>
           <w:bCs/>
         </w:rPr>
-        <w:t xml:space="preserve">1. </w:t>
-      </w:r>
-      <w:r>
-        <w:rPr>
-          <w:b/>
-          <w:bCs/>
-        </w:rPr>
-        <w:t xml:space="preserve">ORM là </w:t>
-      </w:r>
-      <w:proofErr w:type="gramStart"/>
-      <w:r>
-        <w:rPr>
-          <w:b/>
-          <w:bCs/>
-        </w:rPr>
-        <w:t>gì ?</w:t>
-      </w:r>
-      <w:proofErr w:type="gramEnd"/>
-      <w:r>
-        <w:rPr>
-          <w:b/>
-          <w:bCs/>
-        </w:rPr>
-        <w:t xml:space="preserve"> Sử dụng ORM mang lại lợi ích như thế nào cho ứng dụng. Cơ chế hoạt động của ORM như thế nào? So sánh performance của việc sử dụng ORM vs JDBC</w:t>
+        <w:t>1. ORM là gì ? Sử dụng ORM mang lại lợi ích như thế nào cho ứng dụng. Cơ chế hoạt động của ORM như thế nào? So sánh performance của việc sử dụng ORM vs JDBC</w:t>
       </w:r>
     </w:p>
     <w:p>
@@ -72,10 +49,7 @@
         <w:t>.</w:t>
       </w:r>
       <w:r>
-        <w:t xml:space="preserve"> </w:t>
-      </w:r>
-      <w:r>
-        <w:t>Về cơ bản, ORM tạo ra một "cầu nối" giữa mô hình hướng đối tượng của ứng dụng (các class, object) và mô hình quan hệ của cơ sở dữ liệu (các bảng, hàng, cột).</w:t>
+        <w:t xml:space="preserve"> Về cơ bản, ORM tạo ra một "cầu nối" giữa mô hình hướng đối tượng của ứng dụng (các class, object) và mô hình quan hệ của cơ sở dữ liệu (các bảng, hàng, cột).</w:t>
       </w:r>
       <w:r>
         <w:t xml:space="preserve"> </w:t>
@@ -240,15 +214,7 @@
         <w:t xml:space="preserve">: </w:t>
       </w:r>
       <w:r>
-        <w:t xml:space="preserve">Đây là bước đầu tiên và quan trọng nhất. ORM sử dụng một tệp cấu </w:t>
-      </w:r>
-      <w:proofErr w:type="gramStart"/>
-      <w:r>
-        <w:t>hình  để</w:t>
-      </w:r>
-      <w:proofErr w:type="gramEnd"/>
-      <w:r>
-        <w:t xml:space="preserve"> xác định cách các lớp (class) trong ứng dụng tương ứng với các bảng (table) trong cơ sở dữ liệu.</w:t>
+        <w:t>Đây là bước đầu tiên và quan trọng nhất. ORM sử dụng một tệp cấu hình  để xác định cách các lớp (class) trong ứng dụng tương ứng với các bảng (table) trong cơ sở dữ liệu.</w:t>
       </w:r>
     </w:p>
     <w:p>
@@ -482,15 +448,7 @@
         <w:t>ọi:</w:t>
       </w:r>
       <w:r>
-        <w:t xml:space="preserve"> </w:t>
-      </w:r>
-      <w:proofErr w:type="gramStart"/>
-      <w:r>
-        <w:t>user.setName</w:t>
-      </w:r>
-      <w:proofErr w:type="gramEnd"/>
-      <w:r>
-        <w:t>("Jane Doe"); userRepository.save(user)</w:t>
+        <w:t xml:space="preserve"> user.setName("Jane Doe"); userRepository.save(user)</w:t>
       </w:r>
     </w:p>
     <w:p>
@@ -1359,142 +1317,85 @@
     </w:p>
     <w:p>
       <w:pPr>
-        <w:ind w:left="720" w:firstLine="0"/>
-      </w:pPr>
-    </w:p>
-    <w:p/>
-    <w:p/>
-    <w:p/>
-    <w:p/>
-    <w:p>
-      <w:pPr>
-        <w:rPr>
-          <w:b/>
-          <w:bCs/>
-        </w:rPr>
-      </w:pPr>
+        <w:rPr>
+          <w:b/>
+          <w:bCs/>
+        </w:rPr>
+      </w:pPr>
+      <w:r>
+        <w:br/>
+      </w:r>
+      <w:r>
+        <w:rPr>
+          <w:b/>
+          <w:bCs/>
+        </w:rPr>
+        <w:t>2. Spring JPA có phải là 1 triển khai của ORM hay không ?</w:t>
+      </w:r>
+    </w:p>
+    <w:p>
+      <w:r>
+        <w:rPr>
+          <w:rFonts w:hint="cs"/>
+          <w:b/>
+          <w:bCs/>
+        </w:rPr>
+        <w:t>Spring JPA</w:t>
+      </w:r>
+      <w:r>
+        <w:rPr>
+          <w:rFonts w:hint="cs"/>
+        </w:rPr>
+        <w:t> (Java Persistence API) là một phần của </w:t>
+      </w:r>
+      <w:r>
+        <w:rPr>
+          <w:rFonts w:hint="cs"/>
+          <w:b/>
+          <w:bCs/>
+        </w:rPr>
+        <w:t>Spring Framework</w:t>
+      </w:r>
+      <w:r>
+        <w:rPr>
+          <w:rFonts w:hint="cs"/>
+        </w:rPr>
+        <w:t> và là một phần mở rộng của </w:t>
+      </w:r>
+      <w:r>
+        <w:rPr>
+          <w:rFonts w:hint="cs"/>
+          <w:b/>
+          <w:bCs/>
+        </w:rPr>
+        <w:t>ORM</w:t>
+      </w:r>
+      <w:r>
+        <w:rPr>
+          <w:rFonts w:hint="cs"/>
+        </w:rPr>
+        <w:t>. Nó cung cấp một cách dễ dàng để làm việc với cơ sở dữ liệu trong ứng dụng Spring. </w:t>
+      </w:r>
+      <w:r>
+        <w:rPr>
+          <w:rFonts w:hint="cs"/>
+          <w:b/>
+          <w:bCs/>
+        </w:rPr>
+        <w:t>Spring JPA</w:t>
+      </w:r>
+      <w:r>
+        <w:rPr>
+          <w:rFonts w:hint="cs"/>
+        </w:rPr>
+        <w:t> tự động tạo các truy vấn SQL dựa trên các phương thức trong các repository và cung cấp tích hợp mạnh mẽ với Hibernate - một trong các công cụ ORM phổ biến nhất trong cộng đồng Java.</w:t>
+      </w:r>
+    </w:p>
+    <w:p>
       <w:r>
         <w:lastRenderedPageBreak/>
         <w:br/>
-      </w:r>
-      <w:r>
-        <w:rPr>
-          <w:b/>
-          <w:bCs/>
-        </w:rPr>
-        <w:t xml:space="preserve">2. </w:t>
-      </w:r>
-      <w:r>
-        <w:rPr>
-          <w:b/>
-          <w:bCs/>
-        </w:rPr>
-        <w:t xml:space="preserve">Spring JPA có phải là 1 triển khai của ORM hay </w:t>
-      </w:r>
-      <w:proofErr w:type="gramStart"/>
-      <w:r>
-        <w:rPr>
-          <w:b/>
-          <w:bCs/>
-        </w:rPr>
-        <w:t>không ?</w:t>
-      </w:r>
-      <w:proofErr w:type="gramEnd"/>
-    </w:p>
-    <w:p>
-      <w:r>
-        <w:rPr>
-          <w:rFonts w:hint="cs"/>
-          <w:b/>
-          <w:bCs/>
-        </w:rPr>
-        <w:t>Spring JPA</w:t>
-      </w:r>
-      <w:r>
-        <w:rPr>
-          <w:rFonts w:hint="cs"/>
-        </w:rPr>
-        <w:t> (Java Persistence API) là một phần của </w:t>
-      </w:r>
-      <w:r>
-        <w:rPr>
-          <w:rFonts w:hint="cs"/>
-          <w:b/>
-          <w:bCs/>
-        </w:rPr>
-        <w:t>Spring Framework</w:t>
-      </w:r>
-      <w:r>
-        <w:rPr>
-          <w:rFonts w:hint="cs"/>
-        </w:rPr>
-        <w:t> và là một phần mở rộng của </w:t>
-      </w:r>
-      <w:r>
-        <w:rPr>
-          <w:rFonts w:hint="cs"/>
-          <w:b/>
-          <w:bCs/>
-        </w:rPr>
-        <w:t>ORM</w:t>
-      </w:r>
-      <w:r>
-        <w:rPr>
-          <w:rFonts w:hint="cs"/>
-        </w:rPr>
-        <w:t>. Nó cung cấp một cách dễ dàng để làm việc với cơ sở dữ liệu trong ứng dụng Spring. </w:t>
-      </w:r>
-      <w:r>
-        <w:rPr>
-          <w:rFonts w:hint="cs"/>
-          <w:b/>
-          <w:bCs/>
-        </w:rPr>
-        <w:t>Spring JPA</w:t>
-      </w:r>
-      <w:r>
-        <w:rPr>
-          <w:rFonts w:hint="cs"/>
-        </w:rPr>
-        <w:t> tự động tạo các truy vấn SQL dựa trên các phương thức trong các repository và cung cấp tích hợp mạnh mẽ với Hibernate - một trong các công cụ ORM phổ biến nhất trong cộng đồng Java.</w:t>
-      </w:r>
-    </w:p>
-    <w:p>
-      <w:r>
-        <w:br/>
-        <w:t xml:space="preserve">+ Tìm hiểu các loại quan hệ trong </w:t>
-      </w:r>
-      <w:proofErr w:type="gramStart"/>
-      <w:r>
-        <w:t>JPA :</w:t>
-      </w:r>
-      <w:proofErr w:type="gramEnd"/>
-      <w:r>
-        <w:t xml:space="preserve"> Many </w:t>
-      </w:r>
-      <w:proofErr w:type="gramStart"/>
-      <w:r>
-        <w:t>To</w:t>
-      </w:r>
-      <w:proofErr w:type="gramEnd"/>
-      <w:r>
-        <w:t xml:space="preserve"> One, One </w:t>
-      </w:r>
-      <w:proofErr w:type="gramStart"/>
-      <w:r>
-        <w:t>To</w:t>
-      </w:r>
-      <w:proofErr w:type="gramEnd"/>
-      <w:r>
-        <w:t xml:space="preserve"> Many, Many </w:t>
-      </w:r>
-      <w:proofErr w:type="gramStart"/>
-      <w:r>
-        <w:t>To</w:t>
-      </w:r>
-      <w:proofErr w:type="gramEnd"/>
-      <w:r>
-        <w:t xml:space="preserve"> Many</w:t>
+        <w:t>+ Tìm hiểu các loại quan hệ trong JPA : Many To One, One To Many, Many To Many</w:t>
       </w:r>
     </w:p>
     <w:p>
@@ -1603,14 +1504,7 @@
           <w:b/>
           <w:bCs/>
         </w:rPr>
-        <w:t>@</w:t>
-      </w:r>
-      <w:r>
-        <w:rPr>
-          <w:b/>
-          <w:bCs/>
-        </w:rPr>
-        <w:t>One-to-Many</w:t>
+        <w:t>@One-to-Many</w:t>
       </w:r>
       <w:r>
         <w:rPr>
@@ -1694,11 +1588,9 @@
       <w:pPr>
         <w:ind w:left="720" w:firstLine="0"/>
       </w:pPr>
-      <w:proofErr w:type="gramStart"/>
       <w:r>
         <w:t>@Entity</w:t>
       </w:r>
-      <w:proofErr w:type="gramEnd"/>
     </w:p>
     <w:p>
       <w:pPr>
@@ -1713,28 +1605,15 @@
         <w:ind w:left="720" w:firstLine="0"/>
       </w:pPr>
       <w:r>
-        <w:t xml:space="preserve">    </w:t>
-      </w:r>
-      <w:proofErr w:type="gramStart"/>
-      <w:r>
-        <w:t>@ManyToOne</w:t>
-      </w:r>
-      <w:proofErr w:type="gramEnd"/>
+        <w:t xml:space="preserve">    @ManyToOne</w:t>
+      </w:r>
     </w:p>
     <w:p>
       <w:pPr>
         <w:ind w:left="720" w:firstLine="0"/>
       </w:pPr>
       <w:r>
-        <w:t xml:space="preserve">    @</w:t>
-      </w:r>
-      <w:proofErr w:type="gramStart"/>
-      <w:r>
-        <w:t>JoinColumn(</w:t>
-      </w:r>
-      <w:proofErr w:type="gramEnd"/>
-      <w:r>
-        <w:t>name = "department_id")</w:t>
+        <w:t xml:space="preserve">    @JoinColumn(name = "department_id")</w:t>
       </w:r>
     </w:p>
     <w:p>
@@ -1742,69 +1621,49 @@
         <w:ind w:left="720" w:firstLine="0"/>
       </w:pPr>
       <w:r>
+        <w:t xml:space="preserve">    private Department department;</w:t>
+      </w:r>
+    </w:p>
+    <w:p>
+      <w:pPr>
+        <w:ind w:left="720" w:firstLine="0"/>
+      </w:pPr>
+      <w:r>
+        <w:t>}</w:t>
+      </w:r>
+    </w:p>
+    <w:p>
+      <w:pPr>
+        <w:ind w:left="720" w:firstLine="0"/>
+      </w:pPr>
+      <w:r>
+        <w:t>@Entity</w:t>
+      </w:r>
+    </w:p>
+    <w:p>
+      <w:pPr>
+        <w:ind w:left="720" w:firstLine="0"/>
+      </w:pPr>
+      <w:r>
+        <w:t>public class Department {</w:t>
+      </w:r>
+    </w:p>
+    <w:p>
+      <w:pPr>
+        <w:ind w:left="720" w:firstLine="0"/>
+      </w:pPr>
+      <w:r>
+        <w:t xml:space="preserve">    @OneToMany(mappedBy = "department")</w:t>
+      </w:r>
+    </w:p>
+    <w:p>
+      <w:pPr>
+        <w:ind w:left="720" w:firstLine="0"/>
+      </w:pPr>
+      <w:r>
         <w:lastRenderedPageBreak/>
-        <w:t xml:space="preserve">    private Department </w:t>
-      </w:r>
-      <w:proofErr w:type="gramStart"/>
-      <w:r>
-        <w:t>department;</w:t>
-      </w:r>
-      <w:proofErr w:type="gramEnd"/>
-    </w:p>
-    <w:p>
-      <w:pPr>
-        <w:ind w:left="720" w:firstLine="0"/>
-      </w:pPr>
-      <w:r>
-        <w:t>}</w:t>
-      </w:r>
-    </w:p>
-    <w:p>
-      <w:pPr>
-        <w:ind w:left="720" w:firstLine="0"/>
-      </w:pPr>
-      <w:proofErr w:type="gramStart"/>
-      <w:r>
-        <w:t>@Entity</w:t>
-      </w:r>
-      <w:proofErr w:type="gramEnd"/>
-    </w:p>
-    <w:p>
-      <w:pPr>
-        <w:ind w:left="720" w:firstLine="0"/>
-      </w:pPr>
-      <w:r>
-        <w:t>public class Department {</w:t>
-      </w:r>
-    </w:p>
-    <w:p>
-      <w:pPr>
-        <w:ind w:left="720" w:firstLine="0"/>
-      </w:pPr>
-      <w:r>
-        <w:t xml:space="preserve">    @</w:t>
-      </w:r>
-      <w:proofErr w:type="gramStart"/>
-      <w:r>
-        <w:t>OneToMany(</w:t>
-      </w:r>
-      <w:proofErr w:type="gramEnd"/>
-      <w:r>
-        <w:t>mappedBy = "department")</w:t>
-      </w:r>
-    </w:p>
-    <w:p>
-      <w:pPr>
-        <w:ind w:left="720" w:firstLine="0"/>
-      </w:pPr>
-      <w:r>
-        <w:t xml:space="preserve">    private List&lt;Employee&gt; </w:t>
-      </w:r>
-      <w:proofErr w:type="gramStart"/>
-      <w:r>
-        <w:t>employees;</w:t>
-      </w:r>
-      <w:proofErr w:type="gramEnd"/>
+        <w:t xml:space="preserve">    private List&lt;Employee&gt; employees;</w:t>
+      </w:r>
     </w:p>
     <w:p>
       <w:pPr>
@@ -1962,7 +1821,6 @@
           <w:b/>
           <w:bCs/>
         </w:rPr>
-        <w:lastRenderedPageBreak/>
         <w:t>CascadeType.MERGE</w:t>
       </w:r>
       <w:r>
@@ -2011,39 +1869,25 @@
       </w:pPr>
     </w:p>
     <w:p>
-      <w:proofErr w:type="gramStart"/>
       <w:r>
         <w:t>@Entity</w:t>
       </w:r>
-      <w:proofErr w:type="gramEnd"/>
-    </w:p>
-    <w:p>
-      <w:r>
+    </w:p>
+    <w:p>
+      <w:r>
+        <w:lastRenderedPageBreak/>
         <w:t>public class Department {</w:t>
       </w:r>
     </w:p>
     <w:p>
       <w:r>
-        <w:t xml:space="preserve">    @</w:t>
-      </w:r>
-      <w:proofErr w:type="gramStart"/>
-      <w:r>
-        <w:t>OneToMany(</w:t>
-      </w:r>
-      <w:proofErr w:type="gramEnd"/>
-      <w:r>
-        <w:t>mappedBy = "department", cascade = CascadeType.ALL)</w:t>
-      </w:r>
-    </w:p>
-    <w:p>
-      <w:r>
-        <w:t xml:space="preserve">    private List&lt;Employee&gt; </w:t>
-      </w:r>
-      <w:proofErr w:type="gramStart"/>
-      <w:r>
-        <w:t>employees;</w:t>
-      </w:r>
-      <w:proofErr w:type="gramEnd"/>
+        <w:t xml:space="preserve">    @OneToMany(mappedBy = "department", cascade = CascadeType.ALL)</w:t>
+      </w:r>
+    </w:p>
+    <w:p>
+      <w:r>
+        <w:t xml:space="preserve">    private List&lt;Employee&gt; employees;</w:t>
+      </w:r>
     </w:p>
     <w:p>
       <w:r>
@@ -2179,7 +2023,6 @@
           <w:b/>
           <w:bCs/>
         </w:rPr>
-        <w:lastRenderedPageBreak/>
         <w:t>Lợi ích:</w:t>
       </w:r>
       <w:r>
@@ -2208,15 +2051,1552 @@
     <w:p>
       <w:r>
         <w:br/>
-        <w:t xml:space="preserve">+ Tìm hiểu cách convert DTO -&gt; Entity và ngược lại sử dụng 2 </w:t>
-      </w:r>
-      <w:proofErr w:type="gramStart"/>
-      <w:r>
-        <w:t>cách :</w:t>
-      </w:r>
-      <w:proofErr w:type="gramEnd"/>
-      <w:r>
-        <w:t xml:space="preserve"> dùng thư viện và sử dụng java reflection</w:t>
+        <w:t>+ Tìm hiểu cách convert DTO -&gt; Entity và ngược lại sử dụng 2 cách : dùng thư viện và sử dụng java reflection</w:t>
+      </w:r>
+    </w:p>
+    <w:p/>
+    <w:p>
+      <w:pPr>
+        <w:ind w:left="720" w:firstLine="0"/>
+        <w:rPr>
+          <w:b/>
+          <w:bCs/>
+        </w:rPr>
+      </w:pPr>
+      <w:r>
+        <w:rPr>
+          <w:b/>
+          <w:bCs/>
+        </w:rPr>
+        <w:lastRenderedPageBreak/>
+        <w:t>Convert DTO - &gt; Entity và ngược lại</w:t>
+      </w:r>
+    </w:p>
+    <w:p>
+      <w:r>
+        <w:rPr>
+          <w:b/>
+          <w:bCs/>
+          <w:color w:val="EE0000"/>
+        </w:rPr>
+        <w:t>MapStruct</w:t>
+      </w:r>
+      <w:r>
+        <w:rPr>
+          <w:color w:val="EE0000"/>
+        </w:rPr>
+        <w:t xml:space="preserve"> </w:t>
+      </w:r>
+      <w:r>
+        <w:t>là một thư viện phổ biến, chuyên để tạo ra mã chuyển đổi tự động.</w:t>
+      </w:r>
+      <w:r>
+        <w:t xml:space="preserve"> </w:t>
+      </w:r>
+      <w:r>
+        <w:t xml:space="preserve">MapStruct tạo ra các đoạn </w:t>
+      </w:r>
+      <w:r>
+        <w:t xml:space="preserve">code </w:t>
+      </w:r>
+      <w:r>
+        <w:t>thực hiện việc chuyển đổi trong quá trình biên dịch (compile time). Điều này đảm bảo hiệu suất cao và an toàn vì mọi lỗi đều được phát hiện sớm.</w:t>
+      </w:r>
+    </w:p>
+    <w:p>
+      <w:r>
+        <w:rPr>
+          <w:b/>
+          <w:bCs/>
+        </w:rPr>
+        <w:t>Ưu điểm:</w:t>
+      </w:r>
+    </w:p>
+    <w:p>
+      <w:pPr>
+        <w:numPr>
+          <w:ilvl w:val="0"/>
+          <w:numId w:val="12"/>
+        </w:numPr>
+      </w:pPr>
+      <w:r>
+        <w:rPr>
+          <w:b/>
+          <w:bCs/>
+        </w:rPr>
+        <w:t>Hiệu suất cao</w:t>
+      </w:r>
+      <w:r>
+        <w:t>: Mã đã được tạo sẵn, không có chi phí runtime.</w:t>
+      </w:r>
+    </w:p>
+    <w:p>
+      <w:pPr>
+        <w:numPr>
+          <w:ilvl w:val="0"/>
+          <w:numId w:val="12"/>
+        </w:numPr>
+      </w:pPr>
+      <w:r>
+        <w:rPr>
+          <w:b/>
+          <w:bCs/>
+        </w:rPr>
+        <w:t>An toàn</w:t>
+      </w:r>
+      <w:r>
+        <w:t>: Lỗi được phát hiện trong quá trình biên dịch.</w:t>
+      </w:r>
+    </w:p>
+    <w:p>
+      <w:pPr>
+        <w:numPr>
+          <w:ilvl w:val="0"/>
+          <w:numId w:val="12"/>
+        </w:numPr>
+      </w:pPr>
+      <w:r>
+        <w:rPr>
+          <w:b/>
+          <w:bCs/>
+        </w:rPr>
+        <w:t>Bảo trì dễ</w:t>
+      </w:r>
+      <w:r>
+        <w:t>: Mã nguồn gọn gàng, không cần viết logic chuyển đổi thủ công.</w:t>
+      </w:r>
+    </w:p>
+    <w:p/>
+    <w:p>
+      <w:pPr>
+        <w:rPr>
+          <w:b/>
+          <w:bCs/>
+        </w:rPr>
+      </w:pPr>
+      <w:r>
+        <w:rPr>
+          <w:b/>
+          <w:bCs/>
+        </w:rPr>
+        <w:t>@Mapping</w:t>
+      </w:r>
+    </w:p>
+    <w:p>
+      <w:r>
+        <w:t>Annotation này là quan trọng nhất, cho phép chỉ định cách ánh xạ giữa các trường.</w:t>
+      </w:r>
+    </w:p>
+    <w:p>
+      <w:pPr>
+        <w:numPr>
+          <w:ilvl w:val="0"/>
+          <w:numId w:val="15"/>
+        </w:numPr>
+      </w:pPr>
+      <w:r>
+        <w:rPr>
+          <w:b/>
+          <w:bCs/>
+        </w:rPr>
+        <w:t>source</w:t>
+      </w:r>
+      <w:r>
+        <w:t>: Tên của trường trong đối tượng nguồn.</w:t>
+      </w:r>
+    </w:p>
+    <w:p>
+      <w:pPr>
+        <w:numPr>
+          <w:ilvl w:val="0"/>
+          <w:numId w:val="15"/>
+        </w:numPr>
+      </w:pPr>
+      <w:r>
+        <w:rPr>
+          <w:b/>
+          <w:bCs/>
+        </w:rPr>
+        <w:t>target</w:t>
+      </w:r>
+      <w:r>
+        <w:t>: Tên của trường trong đối tượng đích.</w:t>
+      </w:r>
+    </w:p>
+    <w:p>
+      <w:r>
+        <w:t>@</w:t>
+      </w:r>
+      <w:r>
+        <w:rPr>
+          <w:b/>
+          <w:bCs/>
+        </w:rPr>
+        <w:t>InheritInverseConfiguration</w:t>
+      </w:r>
+    </w:p>
+    <w:p>
+      <w:r>
+        <w:t>Dùng để tự động tạo ánh xạ ngược lại (từ đích sang nguồn) dựa trên cấu hình đã có. Điều này giúp tránh việc lặp lại mã.</w:t>
+      </w:r>
+    </w:p>
+    <w:p>
+      <w:pPr>
+        <w:shd w:val="clear" w:color="auto" w:fill="282A36"/>
+        <w:tabs>
+          <w:tab w:val="left" w:pos="916"/>
+          <w:tab w:val="left" w:pos="1832"/>
+          <w:tab w:val="left" w:pos="2748"/>
+          <w:tab w:val="left" w:pos="3664"/>
+          <w:tab w:val="left" w:pos="4580"/>
+          <w:tab w:val="left" w:pos="5496"/>
+          <w:tab w:val="left" w:pos="6412"/>
+          <w:tab w:val="left" w:pos="7328"/>
+          <w:tab w:val="left" w:pos="8244"/>
+          <w:tab w:val="left" w:pos="9160"/>
+          <w:tab w:val="left" w:pos="10076"/>
+          <w:tab w:val="left" w:pos="10992"/>
+          <w:tab w:val="left" w:pos="11908"/>
+          <w:tab w:val="left" w:pos="12824"/>
+          <w:tab w:val="left" w:pos="13740"/>
+          <w:tab w:val="left" w:pos="14656"/>
+        </w:tabs>
+        <w:spacing w:after="0" w:line="240" w:lineRule="auto"/>
+        <w:ind w:firstLine="0"/>
+        <w:jc w:val="left"/>
+        <w:rPr>
+          <w:rFonts w:ascii="Courier New" w:eastAsia="Times New Roman" w:hAnsi="Courier New" w:cs="Courier New"/>
+          <w:color w:val="F8F8F2"/>
+          <w:kern w:val="0"/>
+          <w:sz w:val="18"/>
+          <w:szCs w:val="18"/>
+          <w14:ligatures w14:val="none"/>
+        </w:rPr>
+      </w:pPr>
+      <w:r>
+        <w:rPr>
+          <w:rFonts w:ascii="Courier New" w:eastAsia="Times New Roman" w:hAnsi="Courier New" w:cs="Courier New"/>
+          <w:color w:val="50FA78"/>
+          <w:kern w:val="0"/>
+          <w:sz w:val="18"/>
+          <w:szCs w:val="18"/>
+          <w14:ligatures w14:val="none"/>
+        </w:rPr>
+        <w:t>@Mapper</w:t>
+      </w:r>
+      <w:r>
+        <w:rPr>
+          <w:rFonts w:ascii="Courier New" w:eastAsia="Times New Roman" w:hAnsi="Courier New" w:cs="Courier New"/>
+          <w:color w:val="50FA78"/>
+          <w:kern w:val="0"/>
+          <w:sz w:val="18"/>
+          <w:szCs w:val="18"/>
+          <w14:ligatures w14:val="none"/>
+        </w:rPr>
+        <w:br/>
+      </w:r>
+      <w:r>
+        <w:rPr>
+          <w:rFonts w:ascii="Courier New" w:eastAsia="Times New Roman" w:hAnsi="Courier New" w:cs="Courier New"/>
+          <w:color w:val="F780BF"/>
+          <w:kern w:val="0"/>
+          <w:sz w:val="18"/>
+          <w:szCs w:val="18"/>
+          <w14:ligatures w14:val="none"/>
+        </w:rPr>
+        <w:t xml:space="preserve">public interface </w:t>
+      </w:r>
+      <w:r>
+        <w:rPr>
+          <w:rFonts w:ascii="Courier New" w:eastAsia="Times New Roman" w:hAnsi="Courier New" w:cs="Courier New"/>
+          <w:i/>
+          <w:iCs/>
+          <w:color w:val="80FFEA"/>
+          <w:kern w:val="0"/>
+          <w:sz w:val="18"/>
+          <w:szCs w:val="18"/>
+          <w14:ligatures w14:val="none"/>
+        </w:rPr>
+        <w:t xml:space="preserve">UserMapper </w:t>
+      </w:r>
+      <w:r>
+        <w:rPr>
+          <w:rFonts w:ascii="Courier New" w:eastAsia="Times New Roman" w:hAnsi="Courier New" w:cs="Courier New"/>
+          <w:color w:val="F8F8F2"/>
+          <w:kern w:val="0"/>
+          <w:sz w:val="18"/>
+          <w:szCs w:val="18"/>
+          <w14:ligatures w14:val="none"/>
+        </w:rPr>
+        <w:t>{</w:t>
+      </w:r>
+      <w:r>
+        <w:rPr>
+          <w:rFonts w:ascii="Courier New" w:eastAsia="Times New Roman" w:hAnsi="Courier New" w:cs="Courier New"/>
+          <w:color w:val="F8F8F2"/>
+          <w:kern w:val="0"/>
+          <w:sz w:val="18"/>
+          <w:szCs w:val="18"/>
+          <w14:ligatures w14:val="none"/>
+        </w:rPr>
+        <w:br/>
+        <w:t xml:space="preserve">    </w:t>
+      </w:r>
+      <w:r>
+        <w:rPr>
+          <w:rFonts w:ascii="Courier New" w:eastAsia="Times New Roman" w:hAnsi="Courier New" w:cs="Courier New"/>
+          <w:color w:val="50FA78"/>
+          <w:kern w:val="0"/>
+          <w:sz w:val="18"/>
+          <w:szCs w:val="18"/>
+          <w14:ligatures w14:val="none"/>
+        </w:rPr>
+        <w:t>@Mapping</w:t>
+      </w:r>
+      <w:r>
+        <w:rPr>
+          <w:rFonts w:ascii="Courier New" w:eastAsia="Times New Roman" w:hAnsi="Courier New" w:cs="Courier New"/>
+          <w:color w:val="F8F8F2"/>
+          <w:kern w:val="0"/>
+          <w:sz w:val="18"/>
+          <w:szCs w:val="18"/>
+          <w14:ligatures w14:val="none"/>
+        </w:rPr>
+        <w:t>(</w:t>
+      </w:r>
+      <w:r>
+        <w:rPr>
+          <w:rFonts w:ascii="Courier New" w:eastAsia="Times New Roman" w:hAnsi="Courier New" w:cs="Courier New"/>
+          <w:color w:val="F89580"/>
+          <w:kern w:val="0"/>
+          <w:sz w:val="18"/>
+          <w:szCs w:val="18"/>
+          <w14:ligatures w14:val="none"/>
+        </w:rPr>
+        <w:t xml:space="preserve">source </w:t>
+      </w:r>
+      <w:r>
+        <w:rPr>
+          <w:rFonts w:ascii="Courier New" w:eastAsia="Times New Roman" w:hAnsi="Courier New" w:cs="Courier New"/>
+          <w:color w:val="F780BF"/>
+          <w:kern w:val="0"/>
+          <w:sz w:val="18"/>
+          <w:szCs w:val="18"/>
+          <w14:ligatures w14:val="none"/>
+        </w:rPr>
+        <w:t xml:space="preserve">= </w:t>
+      </w:r>
+      <w:r>
+        <w:rPr>
+          <w:rFonts w:ascii="Courier New" w:eastAsia="Times New Roman" w:hAnsi="Courier New" w:cs="Courier New"/>
+          <w:color w:val="FEFF80"/>
+          <w:kern w:val="0"/>
+          <w:sz w:val="18"/>
+          <w:szCs w:val="18"/>
+          <w14:ligatures w14:val="none"/>
+        </w:rPr>
+        <w:t>"userEmail"</w:t>
+      </w:r>
+      <w:r>
+        <w:rPr>
+          <w:rFonts w:ascii="Courier New" w:eastAsia="Times New Roman" w:hAnsi="Courier New" w:cs="Courier New"/>
+          <w:color w:val="F8F8F2"/>
+          <w:kern w:val="0"/>
+          <w:sz w:val="18"/>
+          <w:szCs w:val="18"/>
+          <w14:ligatures w14:val="none"/>
+        </w:rPr>
+        <w:t xml:space="preserve">, </w:t>
+      </w:r>
+      <w:r>
+        <w:rPr>
+          <w:rFonts w:ascii="Courier New" w:eastAsia="Times New Roman" w:hAnsi="Courier New" w:cs="Courier New"/>
+          <w:color w:val="F89580"/>
+          <w:kern w:val="0"/>
+          <w:sz w:val="18"/>
+          <w:szCs w:val="18"/>
+          <w14:ligatures w14:val="none"/>
+        </w:rPr>
+        <w:t xml:space="preserve">target </w:t>
+      </w:r>
+      <w:r>
+        <w:rPr>
+          <w:rFonts w:ascii="Courier New" w:eastAsia="Times New Roman" w:hAnsi="Courier New" w:cs="Courier New"/>
+          <w:color w:val="F780BF"/>
+          <w:kern w:val="0"/>
+          <w:sz w:val="18"/>
+          <w:szCs w:val="18"/>
+          <w14:ligatures w14:val="none"/>
+        </w:rPr>
+        <w:t xml:space="preserve">= </w:t>
+      </w:r>
+      <w:r>
+        <w:rPr>
+          <w:rFonts w:ascii="Courier New" w:eastAsia="Times New Roman" w:hAnsi="Courier New" w:cs="Courier New"/>
+          <w:color w:val="FEFF80"/>
+          <w:kern w:val="0"/>
+          <w:sz w:val="18"/>
+          <w:szCs w:val="18"/>
+          <w14:ligatures w14:val="none"/>
+        </w:rPr>
+        <w:t>"email"</w:t>
+      </w:r>
+      <w:r>
+        <w:rPr>
+          <w:rFonts w:ascii="Courier New" w:eastAsia="Times New Roman" w:hAnsi="Courier New" w:cs="Courier New"/>
+          <w:color w:val="F8F8F2"/>
+          <w:kern w:val="0"/>
+          <w:sz w:val="18"/>
+          <w:szCs w:val="18"/>
+          <w14:ligatures w14:val="none"/>
+        </w:rPr>
+        <w:t>)</w:t>
+      </w:r>
+      <w:r>
+        <w:rPr>
+          <w:rFonts w:ascii="Courier New" w:eastAsia="Times New Roman" w:hAnsi="Courier New" w:cs="Courier New"/>
+          <w:color w:val="F8F8F2"/>
+          <w:kern w:val="0"/>
+          <w:sz w:val="18"/>
+          <w:szCs w:val="18"/>
+          <w14:ligatures w14:val="none"/>
+        </w:rPr>
+        <w:br/>
+        <w:t xml:space="preserve">    User </w:t>
+      </w:r>
+      <w:r>
+        <w:rPr>
+          <w:rFonts w:ascii="Courier New" w:eastAsia="Times New Roman" w:hAnsi="Courier New" w:cs="Courier New"/>
+          <w:color w:val="8AFF80"/>
+          <w:kern w:val="0"/>
+          <w:sz w:val="18"/>
+          <w:szCs w:val="18"/>
+          <w14:ligatures w14:val="none"/>
+        </w:rPr>
+        <w:t>toUser</w:t>
+      </w:r>
+      <w:r>
+        <w:rPr>
+          <w:rFonts w:ascii="Courier New" w:eastAsia="Times New Roman" w:hAnsi="Courier New" w:cs="Courier New"/>
+          <w:color w:val="F8F8F2"/>
+          <w:kern w:val="0"/>
+          <w:sz w:val="18"/>
+          <w:szCs w:val="18"/>
+          <w14:ligatures w14:val="none"/>
+        </w:rPr>
+        <w:t xml:space="preserve">(UserDTO </w:t>
+      </w:r>
+      <w:r>
+        <w:rPr>
+          <w:rFonts w:ascii="Courier New" w:eastAsia="Times New Roman" w:hAnsi="Courier New" w:cs="Courier New"/>
+          <w:i/>
+          <w:iCs/>
+          <w:color w:val="F89580"/>
+          <w:kern w:val="0"/>
+          <w:sz w:val="18"/>
+          <w:szCs w:val="18"/>
+          <w14:ligatures w14:val="none"/>
+        </w:rPr>
+        <w:t>userDTO</w:t>
+      </w:r>
+      <w:r>
+        <w:rPr>
+          <w:rFonts w:ascii="Courier New" w:eastAsia="Times New Roman" w:hAnsi="Courier New" w:cs="Courier New"/>
+          <w:color w:val="F8F8F2"/>
+          <w:kern w:val="0"/>
+          <w:sz w:val="18"/>
+          <w:szCs w:val="18"/>
+          <w14:ligatures w14:val="none"/>
+        </w:rPr>
+        <w:t>);</w:t>
+      </w:r>
+      <w:r>
+        <w:rPr>
+          <w:rFonts w:ascii="Courier New" w:eastAsia="Times New Roman" w:hAnsi="Courier New" w:cs="Courier New"/>
+          <w:color w:val="F8F8F2"/>
+          <w:kern w:val="0"/>
+          <w:sz w:val="18"/>
+          <w:szCs w:val="18"/>
+          <w14:ligatures w14:val="none"/>
+        </w:rPr>
+        <w:br/>
+      </w:r>
+      <w:r>
+        <w:rPr>
+          <w:rFonts w:ascii="Courier New" w:eastAsia="Times New Roman" w:hAnsi="Courier New" w:cs="Courier New"/>
+          <w:color w:val="F8F8F2"/>
+          <w:kern w:val="0"/>
+          <w:sz w:val="18"/>
+          <w:szCs w:val="18"/>
+          <w14:ligatures w14:val="none"/>
+        </w:rPr>
+        <w:br/>
+        <w:t xml:space="preserve">    </w:t>
+      </w:r>
+      <w:r>
+        <w:rPr>
+          <w:rFonts w:ascii="Courier New" w:eastAsia="Times New Roman" w:hAnsi="Courier New" w:cs="Courier New"/>
+          <w:color w:val="50FA78"/>
+          <w:kern w:val="0"/>
+          <w:sz w:val="18"/>
+          <w:szCs w:val="18"/>
+          <w14:ligatures w14:val="none"/>
+        </w:rPr>
+        <w:t>@InheritInverseConfiguration</w:t>
+      </w:r>
+      <w:r>
+        <w:rPr>
+          <w:rFonts w:ascii="Courier New" w:eastAsia="Times New Roman" w:hAnsi="Courier New" w:cs="Courier New"/>
+          <w:color w:val="50FA78"/>
+          <w:kern w:val="0"/>
+          <w:sz w:val="18"/>
+          <w:szCs w:val="18"/>
+          <w14:ligatures w14:val="none"/>
+        </w:rPr>
+        <w:br/>
+        <w:t xml:space="preserve">    </w:t>
+      </w:r>
+      <w:r>
+        <w:rPr>
+          <w:rFonts w:ascii="Courier New" w:eastAsia="Times New Roman" w:hAnsi="Courier New" w:cs="Courier New"/>
+          <w:color w:val="F8F8F2"/>
+          <w:kern w:val="0"/>
+          <w:sz w:val="18"/>
+          <w:szCs w:val="18"/>
+          <w14:ligatures w14:val="none"/>
+        </w:rPr>
+        <w:t xml:space="preserve">UserDTO </w:t>
+      </w:r>
+      <w:r>
+        <w:rPr>
+          <w:rFonts w:ascii="Courier New" w:eastAsia="Times New Roman" w:hAnsi="Courier New" w:cs="Courier New"/>
+          <w:color w:val="8AFF80"/>
+          <w:kern w:val="0"/>
+          <w:sz w:val="18"/>
+          <w:szCs w:val="18"/>
+          <w14:ligatures w14:val="none"/>
+        </w:rPr>
+        <w:t>toUserDTO</w:t>
+      </w:r>
+      <w:r>
+        <w:rPr>
+          <w:rFonts w:ascii="Courier New" w:eastAsia="Times New Roman" w:hAnsi="Courier New" w:cs="Courier New"/>
+          <w:color w:val="F8F8F2"/>
+          <w:kern w:val="0"/>
+          <w:sz w:val="18"/>
+          <w:szCs w:val="18"/>
+          <w14:ligatures w14:val="none"/>
+        </w:rPr>
+        <w:t xml:space="preserve">(User </w:t>
+      </w:r>
+      <w:r>
+        <w:rPr>
+          <w:rFonts w:ascii="Courier New" w:eastAsia="Times New Roman" w:hAnsi="Courier New" w:cs="Courier New"/>
+          <w:i/>
+          <w:iCs/>
+          <w:color w:val="F89580"/>
+          <w:kern w:val="0"/>
+          <w:sz w:val="18"/>
+          <w:szCs w:val="18"/>
+          <w14:ligatures w14:val="none"/>
+        </w:rPr>
+        <w:t>user</w:t>
+      </w:r>
+      <w:r>
+        <w:rPr>
+          <w:rFonts w:ascii="Courier New" w:eastAsia="Times New Roman" w:hAnsi="Courier New" w:cs="Courier New"/>
+          <w:color w:val="F8F8F2"/>
+          <w:kern w:val="0"/>
+          <w:sz w:val="18"/>
+          <w:szCs w:val="18"/>
+          <w14:ligatures w14:val="none"/>
+        </w:rPr>
+        <w:t>);</w:t>
+      </w:r>
+      <w:r>
+        <w:rPr>
+          <w:rFonts w:ascii="Courier New" w:eastAsia="Times New Roman" w:hAnsi="Courier New" w:cs="Courier New"/>
+          <w:color w:val="F8F8F2"/>
+          <w:kern w:val="0"/>
+          <w:sz w:val="18"/>
+          <w:szCs w:val="18"/>
+          <w14:ligatures w14:val="none"/>
+        </w:rPr>
+        <w:br/>
+        <w:t>}</w:t>
+      </w:r>
+    </w:p>
+    <w:p/>
+    <w:p>
+      <w:pPr>
+        <w:rPr>
+          <w:b/>
+          <w:bCs/>
+        </w:rPr>
+      </w:pPr>
+      <w:r>
+        <w:rPr>
+          <w:b/>
+          <w:bCs/>
+        </w:rPr>
+        <w:t>@MappingTarget</w:t>
+      </w:r>
+    </w:p>
+    <w:p>
+      <w:r>
+        <w:t>Sử dụng khi muốn cập nhật một đối tượng đích đã tồn tại thay vì tạo một đối tượng mới. Rất hữu ích khi bạn chỉ muốn cập nhật một vài trường.</w:t>
+      </w:r>
+    </w:p>
+    <w:p>
+      <w:pPr>
+        <w:shd w:val="clear" w:color="auto" w:fill="282A36"/>
+        <w:tabs>
+          <w:tab w:val="left" w:pos="916"/>
+          <w:tab w:val="left" w:pos="1832"/>
+          <w:tab w:val="left" w:pos="2748"/>
+          <w:tab w:val="left" w:pos="3664"/>
+          <w:tab w:val="left" w:pos="4580"/>
+          <w:tab w:val="left" w:pos="5496"/>
+          <w:tab w:val="left" w:pos="6412"/>
+          <w:tab w:val="left" w:pos="7328"/>
+          <w:tab w:val="left" w:pos="8244"/>
+          <w:tab w:val="left" w:pos="9160"/>
+          <w:tab w:val="left" w:pos="10076"/>
+          <w:tab w:val="left" w:pos="10992"/>
+          <w:tab w:val="left" w:pos="11908"/>
+          <w:tab w:val="left" w:pos="12824"/>
+          <w:tab w:val="left" w:pos="13740"/>
+          <w:tab w:val="left" w:pos="14656"/>
+        </w:tabs>
+        <w:spacing w:after="0" w:line="240" w:lineRule="auto"/>
+        <w:ind w:firstLine="0"/>
+        <w:jc w:val="left"/>
+        <w:rPr>
+          <w:rFonts w:ascii="Courier New" w:eastAsia="Times New Roman" w:hAnsi="Courier New" w:cs="Courier New"/>
+          <w:color w:val="F8F8F2"/>
+          <w:kern w:val="0"/>
+          <w:sz w:val="18"/>
+          <w:szCs w:val="18"/>
+          <w14:ligatures w14:val="none"/>
+        </w:rPr>
+      </w:pPr>
+      <w:r>
+        <w:rPr>
+          <w:rFonts w:ascii="Courier New" w:eastAsia="Times New Roman" w:hAnsi="Courier New" w:cs="Courier New"/>
+          <w:color w:val="50FA78"/>
+          <w:kern w:val="0"/>
+          <w:sz w:val="18"/>
+          <w:szCs w:val="18"/>
+          <w14:ligatures w14:val="none"/>
+        </w:rPr>
+        <w:lastRenderedPageBreak/>
+        <w:t>@Mapper</w:t>
+      </w:r>
+      <w:r>
+        <w:rPr>
+          <w:rFonts w:ascii="Courier New" w:eastAsia="Times New Roman" w:hAnsi="Courier New" w:cs="Courier New"/>
+          <w:color w:val="50FA78"/>
+          <w:kern w:val="0"/>
+          <w:sz w:val="18"/>
+          <w:szCs w:val="18"/>
+          <w14:ligatures w14:val="none"/>
+        </w:rPr>
+        <w:br/>
+      </w:r>
+      <w:r>
+        <w:rPr>
+          <w:rFonts w:ascii="Courier New" w:eastAsia="Times New Roman" w:hAnsi="Courier New" w:cs="Courier New"/>
+          <w:color w:val="F780BF"/>
+          <w:kern w:val="0"/>
+          <w:sz w:val="18"/>
+          <w:szCs w:val="18"/>
+          <w14:ligatures w14:val="none"/>
+        </w:rPr>
+        <w:t xml:space="preserve">public interface </w:t>
+      </w:r>
+      <w:r>
+        <w:rPr>
+          <w:rFonts w:ascii="Courier New" w:eastAsia="Times New Roman" w:hAnsi="Courier New" w:cs="Courier New"/>
+          <w:i/>
+          <w:iCs/>
+          <w:color w:val="80FFEA"/>
+          <w:kern w:val="0"/>
+          <w:sz w:val="18"/>
+          <w:szCs w:val="18"/>
+          <w14:ligatures w14:val="none"/>
+        </w:rPr>
+        <w:t xml:space="preserve">UserMapper </w:t>
+      </w:r>
+      <w:r>
+        <w:rPr>
+          <w:rFonts w:ascii="Courier New" w:eastAsia="Times New Roman" w:hAnsi="Courier New" w:cs="Courier New"/>
+          <w:color w:val="F8F8F2"/>
+          <w:kern w:val="0"/>
+          <w:sz w:val="18"/>
+          <w:szCs w:val="18"/>
+          <w14:ligatures w14:val="none"/>
+        </w:rPr>
+        <w:t>{</w:t>
+      </w:r>
+      <w:r>
+        <w:rPr>
+          <w:rFonts w:ascii="Courier New" w:eastAsia="Times New Roman" w:hAnsi="Courier New" w:cs="Courier New"/>
+          <w:color w:val="F8F8F2"/>
+          <w:kern w:val="0"/>
+          <w:sz w:val="18"/>
+          <w:szCs w:val="18"/>
+          <w14:ligatures w14:val="none"/>
+        </w:rPr>
+        <w:br/>
+        <w:t xml:space="preserve">    </w:t>
+      </w:r>
+      <w:r>
+        <w:rPr>
+          <w:rFonts w:ascii="Courier New" w:eastAsia="Times New Roman" w:hAnsi="Courier New" w:cs="Courier New"/>
+          <w:color w:val="50FA78"/>
+          <w:kern w:val="0"/>
+          <w:sz w:val="18"/>
+          <w:szCs w:val="18"/>
+          <w14:ligatures w14:val="none"/>
+        </w:rPr>
+        <w:t>@Mapping</w:t>
+      </w:r>
+      <w:r>
+        <w:rPr>
+          <w:rFonts w:ascii="Courier New" w:eastAsia="Times New Roman" w:hAnsi="Courier New" w:cs="Courier New"/>
+          <w:color w:val="F8F8F2"/>
+          <w:kern w:val="0"/>
+          <w:sz w:val="18"/>
+          <w:szCs w:val="18"/>
+          <w14:ligatures w14:val="none"/>
+        </w:rPr>
+        <w:t>(</w:t>
+      </w:r>
+      <w:r>
+        <w:rPr>
+          <w:rFonts w:ascii="Courier New" w:eastAsia="Times New Roman" w:hAnsi="Courier New" w:cs="Courier New"/>
+          <w:color w:val="F89580"/>
+          <w:kern w:val="0"/>
+          <w:sz w:val="18"/>
+          <w:szCs w:val="18"/>
+          <w14:ligatures w14:val="none"/>
+        </w:rPr>
+        <w:t xml:space="preserve">target </w:t>
+      </w:r>
+      <w:r>
+        <w:rPr>
+          <w:rFonts w:ascii="Courier New" w:eastAsia="Times New Roman" w:hAnsi="Courier New" w:cs="Courier New"/>
+          <w:color w:val="F780BF"/>
+          <w:kern w:val="0"/>
+          <w:sz w:val="18"/>
+          <w:szCs w:val="18"/>
+          <w14:ligatures w14:val="none"/>
+        </w:rPr>
+        <w:t xml:space="preserve">= </w:t>
+      </w:r>
+      <w:r>
+        <w:rPr>
+          <w:rFonts w:ascii="Courier New" w:eastAsia="Times New Roman" w:hAnsi="Courier New" w:cs="Courier New"/>
+          <w:color w:val="FEFF80"/>
+          <w:kern w:val="0"/>
+          <w:sz w:val="18"/>
+          <w:szCs w:val="18"/>
+          <w14:ligatures w14:val="none"/>
+        </w:rPr>
+        <w:t>"id"</w:t>
+      </w:r>
+      <w:r>
+        <w:rPr>
+          <w:rFonts w:ascii="Courier New" w:eastAsia="Times New Roman" w:hAnsi="Courier New" w:cs="Courier New"/>
+          <w:color w:val="F8F8F2"/>
+          <w:kern w:val="0"/>
+          <w:sz w:val="18"/>
+          <w:szCs w:val="18"/>
+          <w14:ligatures w14:val="none"/>
+        </w:rPr>
+        <w:t xml:space="preserve">, </w:t>
+      </w:r>
+      <w:r>
+        <w:rPr>
+          <w:rFonts w:ascii="Courier New" w:eastAsia="Times New Roman" w:hAnsi="Courier New" w:cs="Courier New"/>
+          <w:color w:val="F89580"/>
+          <w:kern w:val="0"/>
+          <w:sz w:val="18"/>
+          <w:szCs w:val="18"/>
+          <w14:ligatures w14:val="none"/>
+        </w:rPr>
+        <w:t xml:space="preserve">ignore </w:t>
+      </w:r>
+      <w:r>
+        <w:rPr>
+          <w:rFonts w:ascii="Courier New" w:eastAsia="Times New Roman" w:hAnsi="Courier New" w:cs="Courier New"/>
+          <w:color w:val="F780BF"/>
+          <w:kern w:val="0"/>
+          <w:sz w:val="18"/>
+          <w:szCs w:val="18"/>
+          <w14:ligatures w14:val="none"/>
+        </w:rPr>
+        <w:t>= true</w:t>
+      </w:r>
+      <w:r>
+        <w:rPr>
+          <w:rFonts w:ascii="Courier New" w:eastAsia="Times New Roman" w:hAnsi="Courier New" w:cs="Courier New"/>
+          <w:color w:val="F8F8F2"/>
+          <w:kern w:val="0"/>
+          <w:sz w:val="18"/>
+          <w:szCs w:val="18"/>
+          <w14:ligatures w14:val="none"/>
+        </w:rPr>
+        <w:t xml:space="preserve">) </w:t>
+      </w:r>
+      <w:r>
+        <w:rPr>
+          <w:rFonts w:ascii="Courier New" w:eastAsia="Times New Roman" w:hAnsi="Courier New" w:cs="Courier New"/>
+          <w:i/>
+          <w:iCs/>
+          <w:color w:val="6272A4"/>
+          <w:kern w:val="0"/>
+          <w:sz w:val="18"/>
+          <w:szCs w:val="18"/>
+          <w14:ligatures w14:val="none"/>
+        </w:rPr>
+        <w:t>// Bỏ qua trường id</w:t>
+      </w:r>
+      <w:r>
+        <w:rPr>
+          <w:rFonts w:ascii="Courier New" w:eastAsia="Times New Roman" w:hAnsi="Courier New" w:cs="Courier New"/>
+          <w:i/>
+          <w:iCs/>
+          <w:color w:val="6272A4"/>
+          <w:kern w:val="0"/>
+          <w:sz w:val="18"/>
+          <w:szCs w:val="18"/>
+          <w14:ligatures w14:val="none"/>
+        </w:rPr>
+        <w:br/>
+        <w:t xml:space="preserve">    </w:t>
+      </w:r>
+      <w:r>
+        <w:rPr>
+          <w:rFonts w:ascii="Courier New" w:eastAsia="Times New Roman" w:hAnsi="Courier New" w:cs="Courier New"/>
+          <w:color w:val="F780BF"/>
+          <w:kern w:val="0"/>
+          <w:sz w:val="18"/>
+          <w:szCs w:val="18"/>
+          <w14:ligatures w14:val="none"/>
+        </w:rPr>
+        <w:t xml:space="preserve">void </w:t>
+      </w:r>
+      <w:r>
+        <w:rPr>
+          <w:rFonts w:ascii="Courier New" w:eastAsia="Times New Roman" w:hAnsi="Courier New" w:cs="Courier New"/>
+          <w:color w:val="8AFF80"/>
+          <w:kern w:val="0"/>
+          <w:sz w:val="18"/>
+          <w:szCs w:val="18"/>
+          <w14:ligatures w14:val="none"/>
+        </w:rPr>
+        <w:t>updateUserFromDTO</w:t>
+      </w:r>
+      <w:r>
+        <w:rPr>
+          <w:rFonts w:ascii="Courier New" w:eastAsia="Times New Roman" w:hAnsi="Courier New" w:cs="Courier New"/>
+          <w:color w:val="F8F8F2"/>
+          <w:kern w:val="0"/>
+          <w:sz w:val="18"/>
+          <w:szCs w:val="18"/>
+          <w14:ligatures w14:val="none"/>
+        </w:rPr>
+        <w:t xml:space="preserve">(UserDTO </w:t>
+      </w:r>
+      <w:r>
+        <w:rPr>
+          <w:rFonts w:ascii="Courier New" w:eastAsia="Times New Roman" w:hAnsi="Courier New" w:cs="Courier New"/>
+          <w:i/>
+          <w:iCs/>
+          <w:color w:val="F89580"/>
+          <w:kern w:val="0"/>
+          <w:sz w:val="18"/>
+          <w:szCs w:val="18"/>
+          <w14:ligatures w14:val="none"/>
+        </w:rPr>
+        <w:t>userDTO</w:t>
+      </w:r>
+      <w:r>
+        <w:rPr>
+          <w:rFonts w:ascii="Courier New" w:eastAsia="Times New Roman" w:hAnsi="Courier New" w:cs="Courier New"/>
+          <w:color w:val="F8F8F2"/>
+          <w:kern w:val="0"/>
+          <w:sz w:val="18"/>
+          <w:szCs w:val="18"/>
+          <w14:ligatures w14:val="none"/>
+        </w:rPr>
+        <w:t xml:space="preserve">, </w:t>
+      </w:r>
+      <w:r>
+        <w:rPr>
+          <w:rFonts w:ascii="Courier New" w:eastAsia="Times New Roman" w:hAnsi="Courier New" w:cs="Courier New"/>
+          <w:color w:val="50FA78"/>
+          <w:kern w:val="0"/>
+          <w:sz w:val="18"/>
+          <w:szCs w:val="18"/>
+          <w14:ligatures w14:val="none"/>
+        </w:rPr>
+        <w:t xml:space="preserve">@MappingTarget </w:t>
+      </w:r>
+      <w:r>
+        <w:rPr>
+          <w:rFonts w:ascii="Courier New" w:eastAsia="Times New Roman" w:hAnsi="Courier New" w:cs="Courier New"/>
+          <w:color w:val="78DCE8"/>
+          <w:kern w:val="0"/>
+          <w:sz w:val="18"/>
+          <w:szCs w:val="18"/>
+          <w14:ligatures w14:val="none"/>
+        </w:rPr>
+        <w:t xml:space="preserve">User </w:t>
+      </w:r>
+      <w:r>
+        <w:rPr>
+          <w:rFonts w:ascii="Courier New" w:eastAsia="Times New Roman" w:hAnsi="Courier New" w:cs="Courier New"/>
+          <w:i/>
+          <w:iCs/>
+          <w:color w:val="F89580"/>
+          <w:kern w:val="0"/>
+          <w:sz w:val="18"/>
+          <w:szCs w:val="18"/>
+          <w14:ligatures w14:val="none"/>
+        </w:rPr>
+        <w:t>user</w:t>
+      </w:r>
+      <w:r>
+        <w:rPr>
+          <w:rFonts w:ascii="Courier New" w:eastAsia="Times New Roman" w:hAnsi="Courier New" w:cs="Courier New"/>
+          <w:color w:val="F8F8F2"/>
+          <w:kern w:val="0"/>
+          <w:sz w:val="18"/>
+          <w:szCs w:val="18"/>
+          <w14:ligatures w14:val="none"/>
+        </w:rPr>
+        <w:t>);</w:t>
+      </w:r>
+      <w:r>
+        <w:rPr>
+          <w:rFonts w:ascii="Courier New" w:eastAsia="Times New Roman" w:hAnsi="Courier New" w:cs="Courier New"/>
+          <w:color w:val="F8F8F2"/>
+          <w:kern w:val="0"/>
+          <w:sz w:val="18"/>
+          <w:szCs w:val="18"/>
+          <w14:ligatures w14:val="none"/>
+        </w:rPr>
+        <w:br/>
+        <w:t>}</w:t>
+      </w:r>
+    </w:p>
+    <w:p>
+      <w:pPr>
+        <w:rPr>
+          <w:b/>
+          <w:bCs/>
+        </w:rPr>
+      </w:pPr>
+    </w:p>
+    <w:p>
+      <w:pPr>
+        <w:rPr>
+          <w:b/>
+          <w:bCs/>
+        </w:rPr>
+      </w:pPr>
+      <w:r>
+        <w:rPr>
+          <w:b/>
+          <w:bCs/>
+        </w:rPr>
+        <w:t>@AfterMapping</w:t>
+      </w:r>
+    </w:p>
+    <w:p>
+      <w:r>
+        <w:t>Được sử dụng trên một phương thức để thực hiện logic tùy chỉnh sau khi quá trình ánh xạ đã hoàn tất.</w:t>
+      </w:r>
+    </w:p>
+    <w:p>
+      <w:pPr>
+        <w:shd w:val="clear" w:color="auto" w:fill="282A36"/>
+        <w:tabs>
+          <w:tab w:val="left" w:pos="916"/>
+          <w:tab w:val="left" w:pos="1832"/>
+          <w:tab w:val="left" w:pos="2748"/>
+          <w:tab w:val="left" w:pos="3664"/>
+          <w:tab w:val="left" w:pos="4580"/>
+          <w:tab w:val="left" w:pos="5496"/>
+          <w:tab w:val="left" w:pos="6412"/>
+          <w:tab w:val="left" w:pos="7328"/>
+          <w:tab w:val="left" w:pos="8244"/>
+          <w:tab w:val="left" w:pos="9160"/>
+          <w:tab w:val="left" w:pos="10076"/>
+          <w:tab w:val="left" w:pos="10992"/>
+          <w:tab w:val="left" w:pos="11908"/>
+          <w:tab w:val="left" w:pos="12824"/>
+          <w:tab w:val="left" w:pos="13740"/>
+          <w:tab w:val="left" w:pos="14656"/>
+        </w:tabs>
+        <w:spacing w:after="0" w:line="240" w:lineRule="auto"/>
+        <w:ind w:firstLine="0"/>
+        <w:jc w:val="left"/>
+        <w:rPr>
+          <w:rFonts w:ascii="Courier New" w:eastAsia="Times New Roman" w:hAnsi="Courier New" w:cs="Courier New"/>
+          <w:color w:val="F8F8F2"/>
+          <w:kern w:val="0"/>
+          <w:sz w:val="18"/>
+          <w:szCs w:val="18"/>
+          <w14:ligatures w14:val="none"/>
+        </w:rPr>
+      </w:pPr>
+      <w:r>
+        <w:rPr>
+          <w:rFonts w:ascii="Courier New" w:eastAsia="Times New Roman" w:hAnsi="Courier New" w:cs="Courier New"/>
+          <w:color w:val="50FA78"/>
+          <w:kern w:val="0"/>
+          <w:sz w:val="18"/>
+          <w:szCs w:val="18"/>
+          <w14:ligatures w14:val="none"/>
+        </w:rPr>
+        <w:t>@Mapper</w:t>
+      </w:r>
+      <w:r>
+        <w:rPr>
+          <w:rFonts w:ascii="Courier New" w:eastAsia="Times New Roman" w:hAnsi="Courier New" w:cs="Courier New"/>
+          <w:color w:val="50FA78"/>
+          <w:kern w:val="0"/>
+          <w:sz w:val="18"/>
+          <w:szCs w:val="18"/>
+          <w14:ligatures w14:val="none"/>
+        </w:rPr>
+        <w:br/>
+      </w:r>
+      <w:r>
+        <w:rPr>
+          <w:rFonts w:ascii="Courier New" w:eastAsia="Times New Roman" w:hAnsi="Courier New" w:cs="Courier New"/>
+          <w:color w:val="F780BF"/>
+          <w:kern w:val="0"/>
+          <w:sz w:val="18"/>
+          <w:szCs w:val="18"/>
+          <w14:ligatures w14:val="none"/>
+        </w:rPr>
+        <w:t xml:space="preserve">public interface </w:t>
+      </w:r>
+      <w:r>
+        <w:rPr>
+          <w:rFonts w:ascii="Courier New" w:eastAsia="Times New Roman" w:hAnsi="Courier New" w:cs="Courier New"/>
+          <w:i/>
+          <w:iCs/>
+          <w:color w:val="80FFEA"/>
+          <w:kern w:val="0"/>
+          <w:sz w:val="18"/>
+          <w:szCs w:val="18"/>
+          <w14:ligatures w14:val="none"/>
+        </w:rPr>
+        <w:t xml:space="preserve">UserMapper </w:t>
+      </w:r>
+      <w:r>
+        <w:rPr>
+          <w:rFonts w:ascii="Courier New" w:eastAsia="Times New Roman" w:hAnsi="Courier New" w:cs="Courier New"/>
+          <w:color w:val="F8F8F2"/>
+          <w:kern w:val="0"/>
+          <w:sz w:val="18"/>
+          <w:szCs w:val="18"/>
+          <w14:ligatures w14:val="none"/>
+        </w:rPr>
+        <w:t>{</w:t>
+      </w:r>
+      <w:r>
+        <w:rPr>
+          <w:rFonts w:ascii="Courier New" w:eastAsia="Times New Roman" w:hAnsi="Courier New" w:cs="Courier New"/>
+          <w:color w:val="F8F8F2"/>
+          <w:kern w:val="0"/>
+          <w:sz w:val="18"/>
+          <w:szCs w:val="18"/>
+          <w14:ligatures w14:val="none"/>
+        </w:rPr>
+        <w:br/>
+        <w:t xml:space="preserve">    User </w:t>
+      </w:r>
+      <w:r>
+        <w:rPr>
+          <w:rFonts w:ascii="Courier New" w:eastAsia="Times New Roman" w:hAnsi="Courier New" w:cs="Courier New"/>
+          <w:color w:val="8AFF80"/>
+          <w:kern w:val="0"/>
+          <w:sz w:val="18"/>
+          <w:szCs w:val="18"/>
+          <w14:ligatures w14:val="none"/>
+        </w:rPr>
+        <w:t>toUser</w:t>
+      </w:r>
+      <w:r>
+        <w:rPr>
+          <w:rFonts w:ascii="Courier New" w:eastAsia="Times New Roman" w:hAnsi="Courier New" w:cs="Courier New"/>
+          <w:color w:val="F8F8F2"/>
+          <w:kern w:val="0"/>
+          <w:sz w:val="18"/>
+          <w:szCs w:val="18"/>
+          <w14:ligatures w14:val="none"/>
+        </w:rPr>
+        <w:t xml:space="preserve">(UserDTO </w:t>
+      </w:r>
+      <w:r>
+        <w:rPr>
+          <w:rFonts w:ascii="Courier New" w:eastAsia="Times New Roman" w:hAnsi="Courier New" w:cs="Courier New"/>
+          <w:i/>
+          <w:iCs/>
+          <w:color w:val="F89580"/>
+          <w:kern w:val="0"/>
+          <w:sz w:val="18"/>
+          <w:szCs w:val="18"/>
+          <w14:ligatures w14:val="none"/>
+        </w:rPr>
+        <w:t>userDTO</w:t>
+      </w:r>
+      <w:r>
+        <w:rPr>
+          <w:rFonts w:ascii="Courier New" w:eastAsia="Times New Roman" w:hAnsi="Courier New" w:cs="Courier New"/>
+          <w:color w:val="F8F8F2"/>
+          <w:kern w:val="0"/>
+          <w:sz w:val="18"/>
+          <w:szCs w:val="18"/>
+          <w14:ligatures w14:val="none"/>
+        </w:rPr>
+        <w:t>);</w:t>
+      </w:r>
+      <w:r>
+        <w:rPr>
+          <w:rFonts w:ascii="Courier New" w:eastAsia="Times New Roman" w:hAnsi="Courier New" w:cs="Courier New"/>
+          <w:color w:val="F8F8F2"/>
+          <w:kern w:val="0"/>
+          <w:sz w:val="18"/>
+          <w:szCs w:val="18"/>
+          <w14:ligatures w14:val="none"/>
+        </w:rPr>
+        <w:br/>
+      </w:r>
+      <w:r>
+        <w:rPr>
+          <w:rFonts w:ascii="Courier New" w:eastAsia="Times New Roman" w:hAnsi="Courier New" w:cs="Courier New"/>
+          <w:color w:val="F8F8F2"/>
+          <w:kern w:val="0"/>
+          <w:sz w:val="18"/>
+          <w:szCs w:val="18"/>
+          <w14:ligatures w14:val="none"/>
+        </w:rPr>
+        <w:br/>
+        <w:t xml:space="preserve">    </w:t>
+      </w:r>
+      <w:r>
+        <w:rPr>
+          <w:rFonts w:ascii="Courier New" w:eastAsia="Times New Roman" w:hAnsi="Courier New" w:cs="Courier New"/>
+          <w:color w:val="50FA78"/>
+          <w:kern w:val="0"/>
+          <w:sz w:val="18"/>
+          <w:szCs w:val="18"/>
+          <w14:ligatures w14:val="none"/>
+        </w:rPr>
+        <w:t>@AfterMapping</w:t>
+      </w:r>
+      <w:r>
+        <w:rPr>
+          <w:rFonts w:ascii="Courier New" w:eastAsia="Times New Roman" w:hAnsi="Courier New" w:cs="Courier New"/>
+          <w:color w:val="50FA78"/>
+          <w:kern w:val="0"/>
+          <w:sz w:val="18"/>
+          <w:szCs w:val="18"/>
+          <w14:ligatures w14:val="none"/>
+        </w:rPr>
+        <w:br/>
+        <w:t xml:space="preserve">    </w:t>
+      </w:r>
+      <w:r>
+        <w:rPr>
+          <w:rFonts w:ascii="Courier New" w:eastAsia="Times New Roman" w:hAnsi="Courier New" w:cs="Courier New"/>
+          <w:color w:val="F780BF"/>
+          <w:kern w:val="0"/>
+          <w:sz w:val="18"/>
+          <w:szCs w:val="18"/>
+          <w14:ligatures w14:val="none"/>
+        </w:rPr>
+        <w:t xml:space="preserve">default void </w:t>
+      </w:r>
+      <w:r>
+        <w:rPr>
+          <w:rFonts w:ascii="Courier New" w:eastAsia="Times New Roman" w:hAnsi="Courier New" w:cs="Courier New"/>
+          <w:color w:val="8AFF80"/>
+          <w:kern w:val="0"/>
+          <w:sz w:val="18"/>
+          <w:szCs w:val="18"/>
+          <w14:ligatures w14:val="none"/>
+        </w:rPr>
+        <w:t>setCreationDate</w:t>
+      </w:r>
+      <w:r>
+        <w:rPr>
+          <w:rFonts w:ascii="Courier New" w:eastAsia="Times New Roman" w:hAnsi="Courier New" w:cs="Courier New"/>
+          <w:color w:val="F8F8F2"/>
+          <w:kern w:val="0"/>
+          <w:sz w:val="18"/>
+          <w:szCs w:val="18"/>
+          <w14:ligatures w14:val="none"/>
+        </w:rPr>
+        <w:t>(</w:t>
+      </w:r>
+      <w:r>
+        <w:rPr>
+          <w:rFonts w:ascii="Courier New" w:eastAsia="Times New Roman" w:hAnsi="Courier New" w:cs="Courier New"/>
+          <w:color w:val="50FA78"/>
+          <w:kern w:val="0"/>
+          <w:sz w:val="18"/>
+          <w:szCs w:val="18"/>
+          <w14:ligatures w14:val="none"/>
+        </w:rPr>
+        <w:t xml:space="preserve">@MappingTarget </w:t>
+      </w:r>
+      <w:r>
+        <w:rPr>
+          <w:rFonts w:ascii="Courier New" w:eastAsia="Times New Roman" w:hAnsi="Courier New" w:cs="Courier New"/>
+          <w:color w:val="F8F8F2"/>
+          <w:kern w:val="0"/>
+          <w:sz w:val="18"/>
+          <w:szCs w:val="18"/>
+          <w14:ligatures w14:val="none"/>
+        </w:rPr>
+        <w:t xml:space="preserve">User </w:t>
+      </w:r>
+      <w:r>
+        <w:rPr>
+          <w:rFonts w:ascii="Courier New" w:eastAsia="Times New Roman" w:hAnsi="Courier New" w:cs="Courier New"/>
+          <w:i/>
+          <w:iCs/>
+          <w:color w:val="F89580"/>
+          <w:kern w:val="0"/>
+          <w:sz w:val="18"/>
+          <w:szCs w:val="18"/>
+          <w14:ligatures w14:val="none"/>
+        </w:rPr>
+        <w:t>user</w:t>
+      </w:r>
+      <w:r>
+        <w:rPr>
+          <w:rFonts w:ascii="Courier New" w:eastAsia="Times New Roman" w:hAnsi="Courier New" w:cs="Courier New"/>
+          <w:color w:val="F8F8F2"/>
+          <w:kern w:val="0"/>
+          <w:sz w:val="18"/>
+          <w:szCs w:val="18"/>
+          <w14:ligatures w14:val="none"/>
+        </w:rPr>
+        <w:t>) {</w:t>
+      </w:r>
+      <w:r>
+        <w:rPr>
+          <w:rFonts w:ascii="Courier New" w:eastAsia="Times New Roman" w:hAnsi="Courier New" w:cs="Courier New"/>
+          <w:color w:val="F8F8F2"/>
+          <w:kern w:val="0"/>
+          <w:sz w:val="18"/>
+          <w:szCs w:val="18"/>
+          <w14:ligatures w14:val="none"/>
+        </w:rPr>
+        <w:br/>
+        <w:t xml:space="preserve">        </w:t>
+      </w:r>
+      <w:r>
+        <w:rPr>
+          <w:rFonts w:ascii="Courier New" w:eastAsia="Times New Roman" w:hAnsi="Courier New" w:cs="Courier New"/>
+          <w:i/>
+          <w:iCs/>
+          <w:color w:val="F89580"/>
+          <w:kern w:val="0"/>
+          <w:sz w:val="18"/>
+          <w:szCs w:val="18"/>
+          <w14:ligatures w14:val="none"/>
+        </w:rPr>
+        <w:t>user</w:t>
+      </w:r>
+      <w:r>
+        <w:rPr>
+          <w:rFonts w:ascii="Courier New" w:eastAsia="Times New Roman" w:hAnsi="Courier New" w:cs="Courier New"/>
+          <w:color w:val="F8F8F2"/>
+          <w:kern w:val="0"/>
+          <w:sz w:val="18"/>
+          <w:szCs w:val="18"/>
+          <w14:ligatures w14:val="none"/>
+        </w:rPr>
+        <w:t>.setCreatedAt(</w:t>
+      </w:r>
+      <w:r>
+        <w:rPr>
+          <w:rFonts w:ascii="Courier New" w:eastAsia="Times New Roman" w:hAnsi="Courier New" w:cs="Courier New"/>
+          <w:color w:val="F780BF"/>
+          <w:kern w:val="0"/>
+          <w:sz w:val="18"/>
+          <w:szCs w:val="18"/>
+          <w14:ligatures w14:val="none"/>
+        </w:rPr>
+        <w:t xml:space="preserve">new </w:t>
+      </w:r>
+      <w:r>
+        <w:rPr>
+          <w:rFonts w:ascii="Courier New" w:eastAsia="Times New Roman" w:hAnsi="Courier New" w:cs="Courier New"/>
+          <w:color w:val="F8F8F2"/>
+          <w:kern w:val="0"/>
+          <w:sz w:val="18"/>
+          <w:szCs w:val="18"/>
+          <w14:ligatures w14:val="none"/>
+        </w:rPr>
+        <w:t>Date());</w:t>
+      </w:r>
+      <w:r>
+        <w:rPr>
+          <w:rFonts w:ascii="Courier New" w:eastAsia="Times New Roman" w:hAnsi="Courier New" w:cs="Courier New"/>
+          <w:color w:val="F8F8F2"/>
+          <w:kern w:val="0"/>
+          <w:sz w:val="18"/>
+          <w:szCs w:val="18"/>
+          <w14:ligatures w14:val="none"/>
+        </w:rPr>
+        <w:br/>
+        <w:t xml:space="preserve">    }</w:t>
+      </w:r>
+      <w:r>
+        <w:rPr>
+          <w:rFonts w:ascii="Courier New" w:eastAsia="Times New Roman" w:hAnsi="Courier New" w:cs="Courier New"/>
+          <w:color w:val="F8F8F2"/>
+          <w:kern w:val="0"/>
+          <w:sz w:val="18"/>
+          <w:szCs w:val="18"/>
+          <w14:ligatures w14:val="none"/>
+        </w:rPr>
+        <w:br/>
+        <w:t>}</w:t>
+      </w:r>
+    </w:p>
+    <w:p/>
+    <w:p/>
+    <w:p>
+      <w:r>
+        <w:rPr>
+          <w:b/>
+          <w:bCs/>
+          <w:color w:val="EE0000"/>
+        </w:rPr>
+        <w:t>Java Reflection</w:t>
+      </w:r>
+      <w:r>
+        <w:rPr>
+          <w:color w:val="EE0000"/>
+        </w:rPr>
+        <w:t xml:space="preserve"> </w:t>
+      </w:r>
+      <w:r>
+        <w:t xml:space="preserve">là một kỹ thuật cho phép kiểm tra và thay đổi các thành phần của một lớp (trường, phương thức) trong quá trình chạy (runtime). </w:t>
+      </w:r>
+      <w:r>
+        <w:t>V</w:t>
+      </w:r>
+      <w:r>
+        <w:t>iết một phương thức chung sử dụng Reflection để đọc tất cả các trường từ đối tượng nguồn và gán giá trị cho các trường có cùng tên trong đối tượng đích.</w:t>
+      </w:r>
+    </w:p>
+    <w:p>
+      <w:r>
+        <w:rPr>
+          <w:b/>
+          <w:bCs/>
+        </w:rPr>
+        <w:t>Ưu điểm:</w:t>
+      </w:r>
+    </w:p>
+    <w:p>
+      <w:pPr>
+        <w:numPr>
+          <w:ilvl w:val="0"/>
+          <w:numId w:val="13"/>
+        </w:numPr>
+      </w:pPr>
+      <w:r>
+        <w:rPr>
+          <w:b/>
+          <w:bCs/>
+        </w:rPr>
+        <w:t>Không cần thư viện bên ngoài</w:t>
+      </w:r>
+      <w:r>
+        <w:t>: Hoàn toàn độc lập.</w:t>
+      </w:r>
+    </w:p>
+    <w:p>
+      <w:pPr>
+        <w:numPr>
+          <w:ilvl w:val="0"/>
+          <w:numId w:val="13"/>
+        </w:numPr>
+      </w:pPr>
+      <w:r>
+        <w:rPr>
+          <w:b/>
+          <w:bCs/>
+        </w:rPr>
+        <w:t>Linh hoạt</w:t>
+      </w:r>
+      <w:r>
+        <w:t>: Có thể xử lý các đối tượng khác nhau với cùng một phương thức.</w:t>
+      </w:r>
+    </w:p>
+    <w:p>
+      <w:r>
+        <w:rPr>
+          <w:b/>
+          <w:bCs/>
+        </w:rPr>
+        <w:t>Nhược điểm:</w:t>
+      </w:r>
+    </w:p>
+    <w:p>
+      <w:pPr>
+        <w:numPr>
+          <w:ilvl w:val="0"/>
+          <w:numId w:val="14"/>
+        </w:numPr>
+      </w:pPr>
+      <w:r>
+        <w:rPr>
+          <w:b/>
+          <w:bCs/>
+        </w:rPr>
+        <w:t>Hiệu suất thấp</w:t>
+      </w:r>
+      <w:r>
+        <w:t>: Reflection chậm hơn đáng kể vì phải làm việc trong runtime.</w:t>
+      </w:r>
+    </w:p>
+    <w:p>
+      <w:pPr>
+        <w:numPr>
+          <w:ilvl w:val="0"/>
+          <w:numId w:val="14"/>
+        </w:numPr>
+      </w:pPr>
+      <w:r>
+        <w:rPr>
+          <w:b/>
+          <w:bCs/>
+        </w:rPr>
+        <w:t>Không an toàn</w:t>
+      </w:r>
+      <w:r>
+        <w:t>: Lỗi chỉ xảy ra khi chạy, không được phát hiện trong quá trình biên dịch.</w:t>
+      </w:r>
+    </w:p>
+    <w:p>
+      <w:pPr>
+        <w:numPr>
+          <w:ilvl w:val="0"/>
+          <w:numId w:val="14"/>
+        </w:numPr>
+      </w:pPr>
+      <w:r>
+        <w:rPr>
+          <w:b/>
+          <w:bCs/>
+        </w:rPr>
+        <w:t>Khó bảo trì</w:t>
+      </w:r>
+      <w:r>
+        <w:t>: Mã nguồn phức tạp, khó gỡ lỗi.</w:t>
+      </w:r>
+    </w:p>
+    <w:p>
+      <w:r>
+        <w:t>public class ReflectionMapper {</w:t>
+      </w:r>
+    </w:p>
+    <w:p/>
+    <w:p>
+      <w:r>
+        <w:t xml:space="preserve">    public static &lt;S, T&gt; T map(S source, Class&lt;T&gt; targetClass) throws Exception {</w:t>
+      </w:r>
+    </w:p>
+    <w:p>
+      <w:r>
+        <w:t xml:space="preserve">        T target = targetClass.getDeclaredConstructor().newInstance();</w:t>
+      </w:r>
+    </w:p>
+    <w:p/>
+    <w:p>
+      <w:r>
+        <w:t xml:space="preserve">        for (Field sourceField : source.getClass().getDeclaredFields()) {</w:t>
+      </w:r>
+    </w:p>
+    <w:p>
+      <w:r>
+        <w:t xml:space="preserve">            sourceField.setAccessible(true);</w:t>
+      </w:r>
+    </w:p>
+    <w:p>
+      <w:r>
+        <w:t xml:space="preserve">            try {</w:t>
+      </w:r>
+    </w:p>
+    <w:p>
+      <w:r>
+        <w:t xml:space="preserve">                Field targetField = targetClass.getDeclaredField(sourceField.getName());</w:t>
+      </w:r>
+    </w:p>
+    <w:p>
+      <w:r>
+        <w:t xml:space="preserve">             </w:t>
+      </w:r>
+      <w:r>
+        <w:t xml:space="preserve">   </w:t>
+      </w:r>
+      <w:r>
+        <w:t>targetField.setAccessible(true);</w:t>
+      </w:r>
+    </w:p>
+    <w:p>
+      <w:r>
+        <w:t xml:space="preserve">                targetField.set(target, sourceField.get(source));</w:t>
+      </w:r>
+    </w:p>
+    <w:p>
+      <w:r>
+        <w:t xml:space="preserve">            } catch (NoSuchFieldException ignored) {</w:t>
+      </w:r>
+    </w:p>
+    <w:p>
+      <w:r>
+        <w:t xml:space="preserve">                // Bỏ qua các trường không tồn tại trong đối tượng đích</w:t>
+      </w:r>
+    </w:p>
+    <w:p>
+      <w:r>
+        <w:t xml:space="preserve">            }</w:t>
+      </w:r>
+    </w:p>
+    <w:p>
+      <w:r>
+        <w:t xml:space="preserve">        }</w:t>
+      </w:r>
+    </w:p>
+    <w:p>
+      <w:r>
+        <w:t xml:space="preserve">        return target;</w:t>
+      </w:r>
+    </w:p>
+    <w:p>
+      <w:r>
+        <w:t xml:space="preserve">    }</w:t>
+      </w:r>
+    </w:p>
+    <w:p>
+      <w:r>
+        <w:t>}</w:t>
       </w:r>
     </w:p>
     <w:p>
@@ -2233,16 +3613,466 @@
     </w:p>
     <w:p>
       <w:r>
+        <w:rPr>
+          <w:b/>
+          <w:bCs/>
+        </w:rPr>
+        <w:t>Native Query</w:t>
+      </w:r>
+      <w:r>
+        <w:t xml:space="preserve"> là một truy vấn SQL thuần túy (raw SQL) được viết và thực thi trực tiếp trên cơ sở dữ liệu, thay vì sử dụng ngôn ngữ truy vấn của ORM (như JPQL - Java Persistence Query Language).</w:t>
+      </w:r>
+    </w:p>
+    <w:p>
+      <w:pPr>
+        <w:rPr>
+          <w:b/>
+          <w:bCs/>
+        </w:rPr>
+      </w:pPr>
+      <w:r>
+        <w:rPr>
+          <w:b/>
+          <w:bCs/>
+        </w:rPr>
+        <w:lastRenderedPageBreak/>
+        <w:t xml:space="preserve">Cách sử dụng Native Query </w:t>
+      </w:r>
+    </w:p>
+    <w:p>
+      <w:r>
+        <w:t xml:space="preserve">Sử </w:t>
+      </w:r>
+      <w:r>
+        <w:t>dụng Native Query bằng cách thêm thuộc tính nativeQuery = true vào annotation @Query.</w:t>
+      </w:r>
+    </w:p>
+    <w:p>
+      <w:pPr>
+        <w:rPr>
+          <w:b/>
+          <w:bCs/>
+        </w:rPr>
+      </w:pPr>
+      <w:r>
+        <w:rPr>
+          <w:b/>
+          <w:bCs/>
+        </w:rPr>
+        <w:t>Hiệu quả (Performance)</w:t>
+      </w:r>
+    </w:p>
+    <w:p>
+      <w:pPr>
+        <w:numPr>
+          <w:ilvl w:val="0"/>
+          <w:numId w:val="16"/>
+        </w:numPr>
+      </w:pPr>
+      <w:r>
+        <w:rPr>
+          <w:b/>
+          <w:bCs/>
+        </w:rPr>
+        <w:t>Tối ưu hóa cao</w:t>
+      </w:r>
+      <w:r>
+        <w:t>: Native Query có thể được tối ưu hóa ở mức cao nhất, đặc biệt đối với các truy vấn phức tạp hoặc báo cáo lớn. Khi có toàn quyền kiểm soát SQL, có thể viết các câu lệnh hiệu quả hơn nhiều so với câu lệnh do ORM tự động sinh ra.</w:t>
+      </w:r>
+    </w:p>
+    <w:p>
+      <w:pPr>
+        <w:numPr>
+          <w:ilvl w:val="0"/>
+          <w:numId w:val="16"/>
+        </w:numPr>
+      </w:pPr>
+      <w:r>
+        <w:rPr>
+          <w:b/>
+          <w:bCs/>
+        </w:rPr>
+        <w:t>Tận dụng tính năng DBMS</w:t>
+      </w:r>
+      <w:r>
+        <w:t xml:space="preserve">: </w:t>
+      </w:r>
+      <w:r>
+        <w:t>C</w:t>
+      </w:r>
+      <w:r>
+        <w:t>ó thể sử dụng các hàm và tính năng độc quyền của DBMS, điều mà ORM thường không hỗ trợ.</w:t>
+      </w:r>
+    </w:p>
+    <w:p>
+      <w:pPr>
+        <w:rPr>
+          <w:b/>
+          <w:bCs/>
+        </w:rPr>
+      </w:pPr>
+      <w:r>
+        <w:rPr>
+          <w:b/>
+          <w:bCs/>
+        </w:rPr>
+        <w:t>S</w:t>
+      </w:r>
+      <w:r>
+        <w:rPr>
+          <w:b/>
+          <w:bCs/>
+        </w:rPr>
+        <w:t>ử dụng Native Query</w:t>
+      </w:r>
+      <w:r>
+        <w:rPr>
+          <w:b/>
+          <w:bCs/>
+        </w:rPr>
+        <w:t xml:space="preserve"> khi:</w:t>
+      </w:r>
+    </w:p>
+    <w:p>
+      <w:pPr>
+        <w:numPr>
+          <w:ilvl w:val="0"/>
+          <w:numId w:val="17"/>
+        </w:numPr>
+      </w:pPr>
+      <w:r>
+        <w:rPr>
+          <w:b/>
+          <w:bCs/>
+        </w:rPr>
+        <w:t>Truy vấn phức tạp</w:t>
+      </w:r>
+      <w:r>
+        <w:t>: Khi cần viết các truy vấn phức tạp, đòi hỏi hiệu suất cao như các báo cáo, các truy vấn phân tích, hoặc các truy vấn sử dụng nhiều JOIN.</w:t>
+      </w:r>
+    </w:p>
+    <w:p>
+      <w:pPr>
+        <w:numPr>
+          <w:ilvl w:val="0"/>
+          <w:numId w:val="17"/>
+        </w:numPr>
+      </w:pPr>
+      <w:r>
+        <w:rPr>
+          <w:b/>
+          <w:bCs/>
+        </w:rPr>
+        <w:t>Sử dụng các tính năng riêng của DBMS</w:t>
+      </w:r>
+      <w:r>
+        <w:t>: Khi cần dùng đến các tính năng đặc thù của cơ sở dữ liệu như stored procedure, function hay các hàm xử lý chuỗi và ngày tháng riêng.</w:t>
+      </w:r>
+    </w:p>
+    <w:p>
+      <w:pPr>
+        <w:numPr>
+          <w:ilvl w:val="0"/>
+          <w:numId w:val="17"/>
+        </w:numPr>
+      </w:pPr>
+      <w:r>
+        <w:rPr>
+          <w:b/>
+          <w:bCs/>
+        </w:rPr>
+        <w:t>Tối ưu hóa hiệu suất</w:t>
+      </w:r>
+      <w:r>
+        <w:t>: Khi gặp các vấn đề về hiệu suất với các truy vấn của ORM và cần kiểm soát chặt chẽ việc thực thi SQL.</w:t>
+      </w:r>
+    </w:p>
+    <w:p>
+      <w:r>
         <w:br/>
         <w:t>+ Specification, Paging</w:t>
       </w:r>
     </w:p>
     <w:p>
       <w:r>
+        <w:rPr>
+          <w:b/>
+          <w:bCs/>
+        </w:rPr>
+        <w:t>Specification</w:t>
+      </w:r>
+      <w:r>
+        <w:t xml:space="preserve"> trong Spring Data JPA là một kỹ thuật mạnh mẽ, cho phép xây dựng các truy vấn động và phức tạp một cách an toàn và dễ bảo trì</w:t>
+      </w:r>
+      <w:r>
+        <w:t xml:space="preserve">, </w:t>
+      </w:r>
+      <w:r>
+        <w:t>cho phép biểu diễn các tiêu chí tìm kiếm (criteria) dưới dạng các đối tượng.</w:t>
+      </w:r>
+    </w:p>
+    <w:p>
+      <w:pPr>
+        <w:numPr>
+          <w:ilvl w:val="0"/>
+          <w:numId w:val="18"/>
+        </w:numPr>
+      </w:pPr>
+      <w:r>
+        <w:rPr>
+          <w:b/>
+          <w:bCs/>
+        </w:rPr>
+        <w:t>Cách hoạt động</w:t>
+      </w:r>
+      <w:r>
+        <w:t xml:space="preserve">: Specification sử dụng </w:t>
+      </w:r>
+      <w:r>
+        <w:rPr>
+          <w:b/>
+          <w:bCs/>
+        </w:rPr>
+        <w:t>Criteria API</w:t>
+      </w:r>
+      <w:r>
+        <w:t xml:space="preserve"> của JPA để xây dựng một truy vấn có thể thay đổi linh hoạt. Mỗi Specification đại diện cho một điều kiện WHERE đơn lẻ. Bạn có thể kết hợp nhiều Specification với nhau bằng các toán tử như AND, OR, hoặc NOT để tạo ra một truy vấn phức tạp. </w:t>
+      </w:r>
+    </w:p>
+    <w:p>
+      <w:pPr>
+        <w:numPr>
+          <w:ilvl w:val="0"/>
+          <w:numId w:val="18"/>
+        </w:numPr>
+      </w:pPr>
+      <w:r>
+        <w:rPr>
+          <w:b/>
+          <w:bCs/>
+        </w:rPr>
+        <w:lastRenderedPageBreak/>
+        <w:t>Khi nào sử dụng</w:t>
+      </w:r>
+      <w:r>
+        <w:t>: Sử dụng Specification khi cần xây dựng các bộ lọc tìm kiếm động. Ví dụ: một chức năng tìm kiếm sản phẩm với nhiều bộ lọc tùy chọn như giá, màu sắc, kích cỡ, và bạn không biết trước người dùng sẽ sử dụng những bộ lọc nào.</w:t>
+      </w:r>
+    </w:p>
+    <w:p/>
+    <w:p>
+      <w:r>
+        <w:rPr>
+          <w:b/>
+          <w:bCs/>
+        </w:rPr>
+        <w:t>Paging</w:t>
+      </w:r>
+      <w:r>
+        <w:t xml:space="preserve"> (phân trang) là một kỹ thuật phổ biến để chia một tập hợp dữ liệu lớn thành các trang nhỏ hơn. Thay vì tải toàn bộ hàng triệu bản ghi cùng một lúc, chỉ tải một số lượng bản ghi nhất định mỗi lần. </w:t>
+      </w:r>
+    </w:p>
+    <w:p>
+      <w:pPr>
+        <w:numPr>
+          <w:ilvl w:val="0"/>
+          <w:numId w:val="19"/>
+        </w:numPr>
+      </w:pPr>
+      <w:r>
+        <w:rPr>
+          <w:b/>
+          <w:bCs/>
+        </w:rPr>
+        <w:t>Cách hoạt động</w:t>
+      </w:r>
+      <w:r>
+        <w:t>: Trong Spring Data JPA, Paging được thực hiện thông qua interface PagingAndSortingRepository. Khi gọi phương thức tìm kiếm, sẽ truyền vào một đối tượng Pageable.</w:t>
+      </w:r>
+    </w:p>
+    <w:p>
+      <w:pPr>
+        <w:numPr>
+          <w:ilvl w:val="1"/>
+          <w:numId w:val="19"/>
+        </w:numPr>
+      </w:pPr>
+      <w:r>
+        <w:rPr>
+          <w:b/>
+          <w:bCs/>
+        </w:rPr>
+        <w:t>Pageable</w:t>
+      </w:r>
+      <w:r>
+        <w:t xml:space="preserve"> là một interface chứa thông tin về trang hiện tại (page number), số lượng bản ghi trên mỗi trang (page size), và các thông tin sắp xếp (sorting).</w:t>
+      </w:r>
+    </w:p>
+    <w:p>
+      <w:pPr>
+        <w:numPr>
+          <w:ilvl w:val="0"/>
+          <w:numId w:val="19"/>
+        </w:numPr>
+      </w:pPr>
+      <w:r>
+        <w:rPr>
+          <w:b/>
+          <w:bCs/>
+        </w:rPr>
+        <w:t>Kết quả trả về</w:t>
+      </w:r>
+      <w:r>
+        <w:t>: Khi thực hiện một truy vấn phân trang, Spring sẽ trả về một đối tượng Page&lt;T&gt;. Đối tượng này không chỉ chứa danh sách các bản ghi của trang hiện tại, mà còn có các thông tin hữu ích khác như tổng số trang, tổng số bản ghi, và liệu có phải trang đầu tiên/cuối cùng hay không.</w:t>
+      </w:r>
+    </w:p>
+    <w:p>
+      <w:pPr>
+        <w:numPr>
+          <w:ilvl w:val="0"/>
+          <w:numId w:val="19"/>
+        </w:numPr>
+      </w:pPr>
+      <w:r>
+        <w:rPr>
+          <w:b/>
+          <w:bCs/>
+        </w:rPr>
+        <w:t>Khi nào sử dụng</w:t>
+      </w:r>
+      <w:r>
+        <w:t>: Phân trang được sử dụng trong hầu hết các ứng dụng có lượng dữ liệu lớn. Ví dụ: hiển thị danh sách sản phẩm trên trang thương mại điện tử, danh sách bài viết trên blog, hoặc kết quả tìm kiếm.</w:t>
+      </w:r>
+    </w:p>
+    <w:p/>
+    <w:p>
+      <w:r>
         <w:br/>
         <w:t>+ Lấy dữ liệu khi JOIN nhiều bảng sử dụng JPA (mỗi bảng lấy 1 tới 2 trường thông tin)</w:t>
       </w:r>
     </w:p>
+    <w:p>
+      <w:r>
+        <w:t>Phương pháp tốt nhất là tạo một lớp DTO để chứa các trường bạn cần, thay vì lấy toàn bộ entity.</w:t>
+      </w:r>
+    </w:p>
+    <w:p>
+      <w:pPr>
+        <w:rPr>
+          <w:b/>
+          <w:bCs/>
+        </w:rPr>
+      </w:pPr>
+      <w:r>
+        <w:rPr>
+          <w:b/>
+          <w:bCs/>
+        </w:rPr>
+        <w:t>1. Sử dụng JPQL và DTO</w:t>
+      </w:r>
+    </w:p>
+    <w:p>
+      <w:r>
+        <w:t>T</w:t>
+      </w:r>
+      <w:r>
+        <w:t>ạo một constructor trong lớp DTO để nhận các trường cần thiết từ truy vấn.</w:t>
+      </w:r>
+    </w:p>
+    <w:p>
+      <w:r>
+        <w:rPr>
+          <w:b/>
+          <w:bCs/>
+        </w:rPr>
+        <w:lastRenderedPageBreak/>
+        <w:t>Bước 1: Tạo DTO</w:t>
+      </w:r>
+      <w:r>
+        <w:t xml:space="preserve"> Tạo một lớp DTO để chứa các trường bạn muốn lấy từ kết quả JOIN.</w:t>
+      </w:r>
+    </w:p>
+    <w:p>
+      <w:r>
+        <w:rPr>
+          <w:b/>
+          <w:bCs/>
+        </w:rPr>
+        <w:t>Bước 2: Viết truy vấn JPQL trong Repository</w:t>
+      </w:r>
+      <w:r>
+        <w:t xml:space="preserve"> Sử dụng JPQL để SELECT các trường cụ thể và ánh xạ chúng trực tiếp vào constructor của DTO.</w:t>
+      </w:r>
+    </w:p>
+    <w:p>
+      <w:pPr>
+        <w:rPr>
+          <w:b/>
+          <w:bCs/>
+        </w:rPr>
+      </w:pPr>
+      <w:r>
+        <w:rPr>
+          <w:b/>
+          <w:bCs/>
+        </w:rPr>
+        <w:t xml:space="preserve">2. </w:t>
+      </w:r>
+      <w:r>
+        <w:rPr>
+          <w:b/>
+          <w:bCs/>
+        </w:rPr>
+        <w:t>Sử dụng Native Query và SqlResultSetMapping</w:t>
+      </w:r>
+    </w:p>
+    <w:p>
+      <w:r>
+        <w:t xml:space="preserve">Nếu cần sử dụng SQL thuần túy để tận dụng các tính năng riêng của cơ sở dữ liệu (như GROUP BY, các hàm đặc thù), có thể dùng Native Query. </w:t>
+      </w:r>
+      <w:r>
+        <w:t>C</w:t>
+      </w:r>
+      <w:r>
+        <w:t>ần một cách để ánh xạ kết quả từ SQL sang đối tượng DTO.</w:t>
+      </w:r>
+    </w:p>
+    <w:p>
+      <w:r>
+        <w:rPr>
+          <w:b/>
+          <w:bCs/>
+        </w:rPr>
+        <w:t>Bước 1: Tạo DTO</w:t>
+      </w:r>
+      <w:r>
+        <w:t xml:space="preserve"> Lớp DTO tương tự như trên.</w:t>
+      </w:r>
+    </w:p>
+    <w:p>
+      <w:r>
+        <w:rPr>
+          <w:b/>
+          <w:bCs/>
+        </w:rPr>
+        <w:t>Bước 2: Sử dụng @SqlResultSetMapping</w:t>
+      </w:r>
+      <w:r>
+        <w:t xml:space="preserve"> cần khai báo ánh xạ kết quả SQL sang DTO bằng cách sử dụng @SqlResultSetMapping trên một entity hoặc trong file XML.</w:t>
+      </w:r>
+    </w:p>
+    <w:p>
+      <w:r>
+        <w:rPr>
+          <w:b/>
+          <w:bCs/>
+        </w:rPr>
+        <w:t>Bước 3: Viết Native Query trong Repository</w:t>
+      </w:r>
+      <w:r>
+        <w:t xml:space="preserve"> Sau đó, có thể gọi ánh xạ này từ truy vấn Native Query.</w:t>
+      </w:r>
+    </w:p>
+    <w:p/>
     <w:p/>
     <w:sectPr>
       <w:pgSz w:w="12240" w:h="15840" w:code="1"/>
@@ -2257,6 +4087,155 @@
 <file path=word/numbering.xml><?xml version="1.0" encoding="utf-8"?>
 <w:numbering xmlns:wpc="http://schemas.microsoft.com/office/word/2010/wordprocessingCanvas" xmlns:cx="http://schemas.microsoft.com/office/drawing/2014/chartex" xmlns:cx1="http://schemas.microsoft.com/office/drawing/2015/9/8/chartex" xmlns:cx2="http://schemas.microsoft.com/office/drawing/2015/10/21/chartex" xmlns:cx3="http://schemas.microsoft.com/office/drawing/2016/5/9/chartex" xmlns:cx4="http://schemas.microsoft.com/office/drawing/2016/5/10/chartex" xmlns:cx5="http://schemas.microsoft.com/office/drawing/2016/5/11/chartex" xmlns:cx6="http://schemas.microsoft.com/office/drawing/2016/5/12/chartex" xmlns:cx7="http://schemas.microsoft.com/office/drawing/2016/5/13/chartex" xmlns:cx8="http://schemas.microsoft.com/office/drawing/2016/5/14/chartex" xmlns:mc="http://schemas.openxmlformats.org/markup-compatibility/2006" xmlns:aink="http://schemas.microsoft.com/office/drawing/2016/ink" xmlns:am3d="http://schemas.microsoft.com/office/drawing/2017/model3d" xmlns:o="urn:schemas-microsoft-com:office:office" xmlns:oel="http://schemas.microsoft.com/office/2019/extlst" xmlns:r="http://schemas.openxmlformats.org/officeDocument/2006/relationships" xmlns:m="http://schemas.openxmlformats.org/officeDocument/2006/math" xmlns:v="urn:schemas-microsoft-com:vml" xmlns:wp14="http://schemas.microsoft.com/office/word/2010/wordprocessingDrawing" xmlns:wp="http://schemas.openxmlformats.org/drawingml/2006/wordprocessingDrawing" xmlns:w10="urn:schemas-microsoft-com:office:word" xmlns:w="http://schemas.openxmlformats.org/wordprocessingml/2006/main" xmlns:w14="http://schemas.microsoft.com/office/word/2010/wordml" xmlns:w15="http://schemas.microsoft.com/office/word/2012/wordml" xmlns:w16cex="http://schemas.microsoft.com/office/word/2018/wordml/cex" xmlns:w16cid="http://schemas.microsoft.com/office/word/2016/wordml/cid" xmlns:w16="http://schemas.microsoft.com/office/word/2018/wordml" xmlns:w16du="http://schemas.microsoft.com/office/word/2023/wordml/word16du" xmlns:w16sdtdh="http://schemas.microsoft.com/office/word/2020/wordml/sdtdatahash" xmlns:w16sdtfl="http://schemas.microsoft.com/office/word/2024/wordml/sdtformatlock" xmlns:w16se="http://schemas.microsoft.com/office/word/2015/wordml/symex" xmlns:wpg="http://schemas.microsoft.com/office/word/2010/wordprocessingGroup" xmlns:wpi="http://schemas.microsoft.com/office/word/2010/wordprocessingInk" xmlns:wne="http://schemas.microsoft.com/office/word/2006/wordml" xmlns:wps="http://schemas.microsoft.com/office/word/2010/wordprocessingShape" mc:Ignorable="w14 w15 w16se w16cid w16 w16cex w16sdtdh w16sdtfl w16du wp14">
   <w:abstractNum w:abstractNumId="0" w15:restartNumberingAfterBreak="0">
+    <w:nsid w:val="05B113F7"/>
+    <w:multiLevelType w:val="multilevel"/>
+    <w:tmpl w:val="5518FDFC"/>
+    <w:lvl w:ilvl="0">
+      <w:start w:val="1"/>
+      <w:numFmt w:val="bullet"/>
+      <w:lvlText w:val=""/>
+      <w:lvlJc w:val="left"/>
+      <w:pPr>
+        <w:tabs>
+          <w:tab w:val="num" w:pos="720"/>
+        </w:tabs>
+        <w:ind w:left="720" w:hanging="360"/>
+      </w:pPr>
+      <w:rPr>
+        <w:rFonts w:ascii="Symbol" w:hAnsi="Symbol" w:hint="default"/>
+        <w:sz w:val="20"/>
+      </w:rPr>
+    </w:lvl>
+    <w:lvl w:ilvl="1" w:tentative="1">
+      <w:start w:val="1"/>
+      <w:numFmt w:val="bullet"/>
+      <w:lvlText w:val="o"/>
+      <w:lvlJc w:val="left"/>
+      <w:pPr>
+        <w:tabs>
+          <w:tab w:val="num" w:pos="1440"/>
+        </w:tabs>
+        <w:ind w:left="1440" w:hanging="360"/>
+      </w:pPr>
+      <w:rPr>
+        <w:rFonts w:ascii="Courier New" w:hAnsi="Courier New" w:hint="default"/>
+        <w:sz w:val="20"/>
+      </w:rPr>
+    </w:lvl>
+    <w:lvl w:ilvl="2" w:tentative="1">
+      <w:start w:val="1"/>
+      <w:numFmt w:val="bullet"/>
+      <w:lvlText w:val=""/>
+      <w:lvlJc w:val="left"/>
+      <w:pPr>
+        <w:tabs>
+          <w:tab w:val="num" w:pos="2160"/>
+        </w:tabs>
+        <w:ind w:left="2160" w:hanging="360"/>
+      </w:pPr>
+      <w:rPr>
+        <w:rFonts w:ascii="Wingdings" w:hAnsi="Wingdings" w:hint="default"/>
+        <w:sz w:val="20"/>
+      </w:rPr>
+    </w:lvl>
+    <w:lvl w:ilvl="3" w:tentative="1">
+      <w:start w:val="1"/>
+      <w:numFmt w:val="bullet"/>
+      <w:lvlText w:val=""/>
+      <w:lvlJc w:val="left"/>
+      <w:pPr>
+        <w:tabs>
+          <w:tab w:val="num" w:pos="2880"/>
+        </w:tabs>
+        <w:ind w:left="2880" w:hanging="360"/>
+      </w:pPr>
+      <w:rPr>
+        <w:rFonts w:ascii="Wingdings" w:hAnsi="Wingdings" w:hint="default"/>
+        <w:sz w:val="20"/>
+      </w:rPr>
+    </w:lvl>
+    <w:lvl w:ilvl="4" w:tentative="1">
+      <w:start w:val="1"/>
+      <w:numFmt w:val="bullet"/>
+      <w:lvlText w:val=""/>
+      <w:lvlJc w:val="left"/>
+      <w:pPr>
+        <w:tabs>
+          <w:tab w:val="num" w:pos="3600"/>
+        </w:tabs>
+        <w:ind w:left="3600" w:hanging="360"/>
+      </w:pPr>
+      <w:rPr>
+        <w:rFonts w:ascii="Wingdings" w:hAnsi="Wingdings" w:hint="default"/>
+        <w:sz w:val="20"/>
+      </w:rPr>
+    </w:lvl>
+    <w:lvl w:ilvl="5" w:tentative="1">
+      <w:start w:val="1"/>
+      <w:numFmt w:val="bullet"/>
+      <w:lvlText w:val=""/>
+      <w:lvlJc w:val="left"/>
+      <w:pPr>
+        <w:tabs>
+          <w:tab w:val="num" w:pos="4320"/>
+        </w:tabs>
+        <w:ind w:left="4320" w:hanging="360"/>
+      </w:pPr>
+      <w:rPr>
+        <w:rFonts w:ascii="Wingdings" w:hAnsi="Wingdings" w:hint="default"/>
+        <w:sz w:val="20"/>
+      </w:rPr>
+    </w:lvl>
+    <w:lvl w:ilvl="6" w:tentative="1">
+      <w:start w:val="1"/>
+      <w:numFmt w:val="bullet"/>
+      <w:lvlText w:val=""/>
+      <w:lvlJc w:val="left"/>
+      <w:pPr>
+        <w:tabs>
+          <w:tab w:val="num" w:pos="5040"/>
+        </w:tabs>
+        <w:ind w:left="5040" w:hanging="360"/>
+      </w:pPr>
+      <w:rPr>
+        <w:rFonts w:ascii="Wingdings" w:hAnsi="Wingdings" w:hint="default"/>
+        <w:sz w:val="20"/>
+      </w:rPr>
+    </w:lvl>
+    <w:lvl w:ilvl="7" w:tentative="1">
+      <w:start w:val="1"/>
+      <w:numFmt w:val="bullet"/>
+      <w:lvlText w:val=""/>
+      <w:lvlJc w:val="left"/>
+      <w:pPr>
+        <w:tabs>
+          <w:tab w:val="num" w:pos="5760"/>
+        </w:tabs>
+        <w:ind w:left="5760" w:hanging="360"/>
+      </w:pPr>
+      <w:rPr>
+        <w:rFonts w:ascii="Wingdings" w:hAnsi="Wingdings" w:hint="default"/>
+        <w:sz w:val="20"/>
+      </w:rPr>
+    </w:lvl>
+    <w:lvl w:ilvl="8" w:tentative="1">
+      <w:start w:val="1"/>
+      <w:numFmt w:val="bullet"/>
+      <w:lvlText w:val=""/>
+      <w:lvlJc w:val="left"/>
+      <w:pPr>
+        <w:tabs>
+          <w:tab w:val="num" w:pos="6480"/>
+        </w:tabs>
+        <w:ind w:left="6480" w:hanging="360"/>
+      </w:pPr>
+      <w:rPr>
+        <w:rFonts w:ascii="Wingdings" w:hAnsi="Wingdings" w:hint="default"/>
+        <w:sz w:val="20"/>
+      </w:rPr>
+    </w:lvl>
+  </w:abstractNum>
+  <w:abstractNum w:abstractNumId="1" w15:restartNumberingAfterBreak="0">
     <w:nsid w:val="07EC1C47"/>
     <w:multiLevelType w:val="multilevel"/>
     <w:tmpl w:val="68E6A3FA"/>
@@ -2405,7 +4384,305 @@
       </w:rPr>
     </w:lvl>
   </w:abstractNum>
-  <w:abstractNum w:abstractNumId="1" w15:restartNumberingAfterBreak="0">
+  <w:abstractNum w:abstractNumId="2" w15:restartNumberingAfterBreak="0">
+    <w:nsid w:val="0DAE7CEA"/>
+    <w:multiLevelType w:val="multilevel"/>
+    <w:tmpl w:val="DDF20BE8"/>
+    <w:lvl w:ilvl="0">
+      <w:start w:val="1"/>
+      <w:numFmt w:val="bullet"/>
+      <w:lvlText w:val=""/>
+      <w:lvlJc w:val="left"/>
+      <w:pPr>
+        <w:tabs>
+          <w:tab w:val="num" w:pos="720"/>
+        </w:tabs>
+        <w:ind w:left="720" w:hanging="360"/>
+      </w:pPr>
+      <w:rPr>
+        <w:rFonts w:ascii="Symbol" w:hAnsi="Symbol" w:hint="default"/>
+        <w:sz w:val="20"/>
+      </w:rPr>
+    </w:lvl>
+    <w:lvl w:ilvl="1" w:tentative="1">
+      <w:start w:val="1"/>
+      <w:numFmt w:val="bullet"/>
+      <w:lvlText w:val="o"/>
+      <w:lvlJc w:val="left"/>
+      <w:pPr>
+        <w:tabs>
+          <w:tab w:val="num" w:pos="1440"/>
+        </w:tabs>
+        <w:ind w:left="1440" w:hanging="360"/>
+      </w:pPr>
+      <w:rPr>
+        <w:rFonts w:ascii="Courier New" w:hAnsi="Courier New" w:hint="default"/>
+        <w:sz w:val="20"/>
+      </w:rPr>
+    </w:lvl>
+    <w:lvl w:ilvl="2" w:tentative="1">
+      <w:start w:val="1"/>
+      <w:numFmt w:val="bullet"/>
+      <w:lvlText w:val=""/>
+      <w:lvlJc w:val="left"/>
+      <w:pPr>
+        <w:tabs>
+          <w:tab w:val="num" w:pos="2160"/>
+        </w:tabs>
+        <w:ind w:left="2160" w:hanging="360"/>
+      </w:pPr>
+      <w:rPr>
+        <w:rFonts w:ascii="Wingdings" w:hAnsi="Wingdings" w:hint="default"/>
+        <w:sz w:val="20"/>
+      </w:rPr>
+    </w:lvl>
+    <w:lvl w:ilvl="3" w:tentative="1">
+      <w:start w:val="1"/>
+      <w:numFmt w:val="bullet"/>
+      <w:lvlText w:val=""/>
+      <w:lvlJc w:val="left"/>
+      <w:pPr>
+        <w:tabs>
+          <w:tab w:val="num" w:pos="2880"/>
+        </w:tabs>
+        <w:ind w:left="2880" w:hanging="360"/>
+      </w:pPr>
+      <w:rPr>
+        <w:rFonts w:ascii="Wingdings" w:hAnsi="Wingdings" w:hint="default"/>
+        <w:sz w:val="20"/>
+      </w:rPr>
+    </w:lvl>
+    <w:lvl w:ilvl="4" w:tentative="1">
+      <w:start w:val="1"/>
+      <w:numFmt w:val="bullet"/>
+      <w:lvlText w:val=""/>
+      <w:lvlJc w:val="left"/>
+      <w:pPr>
+        <w:tabs>
+          <w:tab w:val="num" w:pos="3600"/>
+        </w:tabs>
+        <w:ind w:left="3600" w:hanging="360"/>
+      </w:pPr>
+      <w:rPr>
+        <w:rFonts w:ascii="Wingdings" w:hAnsi="Wingdings" w:hint="default"/>
+        <w:sz w:val="20"/>
+      </w:rPr>
+    </w:lvl>
+    <w:lvl w:ilvl="5" w:tentative="1">
+      <w:start w:val="1"/>
+      <w:numFmt w:val="bullet"/>
+      <w:lvlText w:val=""/>
+      <w:lvlJc w:val="left"/>
+      <w:pPr>
+        <w:tabs>
+          <w:tab w:val="num" w:pos="4320"/>
+        </w:tabs>
+        <w:ind w:left="4320" w:hanging="360"/>
+      </w:pPr>
+      <w:rPr>
+        <w:rFonts w:ascii="Wingdings" w:hAnsi="Wingdings" w:hint="default"/>
+        <w:sz w:val="20"/>
+      </w:rPr>
+    </w:lvl>
+    <w:lvl w:ilvl="6" w:tentative="1">
+      <w:start w:val="1"/>
+      <w:numFmt w:val="bullet"/>
+      <w:lvlText w:val=""/>
+      <w:lvlJc w:val="left"/>
+      <w:pPr>
+        <w:tabs>
+          <w:tab w:val="num" w:pos="5040"/>
+        </w:tabs>
+        <w:ind w:left="5040" w:hanging="360"/>
+      </w:pPr>
+      <w:rPr>
+        <w:rFonts w:ascii="Wingdings" w:hAnsi="Wingdings" w:hint="default"/>
+        <w:sz w:val="20"/>
+      </w:rPr>
+    </w:lvl>
+    <w:lvl w:ilvl="7" w:tentative="1">
+      <w:start w:val="1"/>
+      <w:numFmt w:val="bullet"/>
+      <w:lvlText w:val=""/>
+      <w:lvlJc w:val="left"/>
+      <w:pPr>
+        <w:tabs>
+          <w:tab w:val="num" w:pos="5760"/>
+        </w:tabs>
+        <w:ind w:left="5760" w:hanging="360"/>
+      </w:pPr>
+      <w:rPr>
+        <w:rFonts w:ascii="Wingdings" w:hAnsi="Wingdings" w:hint="default"/>
+        <w:sz w:val="20"/>
+      </w:rPr>
+    </w:lvl>
+    <w:lvl w:ilvl="8" w:tentative="1">
+      <w:start w:val="1"/>
+      <w:numFmt w:val="bullet"/>
+      <w:lvlText w:val=""/>
+      <w:lvlJc w:val="left"/>
+      <w:pPr>
+        <w:tabs>
+          <w:tab w:val="num" w:pos="6480"/>
+        </w:tabs>
+        <w:ind w:left="6480" w:hanging="360"/>
+      </w:pPr>
+      <w:rPr>
+        <w:rFonts w:ascii="Wingdings" w:hAnsi="Wingdings" w:hint="default"/>
+        <w:sz w:val="20"/>
+      </w:rPr>
+    </w:lvl>
+  </w:abstractNum>
+  <w:abstractNum w:abstractNumId="3" w15:restartNumberingAfterBreak="0">
+    <w:nsid w:val="0DCB5408"/>
+    <w:multiLevelType w:val="multilevel"/>
+    <w:tmpl w:val="0BC6EA4A"/>
+    <w:lvl w:ilvl="0">
+      <w:start w:val="1"/>
+      <w:numFmt w:val="bullet"/>
+      <w:lvlText w:val=""/>
+      <w:lvlJc w:val="left"/>
+      <w:pPr>
+        <w:tabs>
+          <w:tab w:val="num" w:pos="720"/>
+        </w:tabs>
+        <w:ind w:left="720" w:hanging="360"/>
+      </w:pPr>
+      <w:rPr>
+        <w:rFonts w:ascii="Symbol" w:hAnsi="Symbol" w:hint="default"/>
+        <w:sz w:val="20"/>
+      </w:rPr>
+    </w:lvl>
+    <w:lvl w:ilvl="1">
+      <w:start w:val="1"/>
+      <w:numFmt w:val="bullet"/>
+      <w:lvlText w:val="o"/>
+      <w:lvlJc w:val="left"/>
+      <w:pPr>
+        <w:tabs>
+          <w:tab w:val="num" w:pos="1440"/>
+        </w:tabs>
+        <w:ind w:left="1440" w:hanging="360"/>
+      </w:pPr>
+      <w:rPr>
+        <w:rFonts w:ascii="Courier New" w:hAnsi="Courier New" w:hint="default"/>
+        <w:sz w:val="20"/>
+      </w:rPr>
+    </w:lvl>
+    <w:lvl w:ilvl="2" w:tentative="1">
+      <w:start w:val="1"/>
+      <w:numFmt w:val="bullet"/>
+      <w:lvlText w:val=""/>
+      <w:lvlJc w:val="left"/>
+      <w:pPr>
+        <w:tabs>
+          <w:tab w:val="num" w:pos="2160"/>
+        </w:tabs>
+        <w:ind w:left="2160" w:hanging="360"/>
+      </w:pPr>
+      <w:rPr>
+        <w:rFonts w:ascii="Wingdings" w:hAnsi="Wingdings" w:hint="default"/>
+        <w:sz w:val="20"/>
+      </w:rPr>
+    </w:lvl>
+    <w:lvl w:ilvl="3" w:tentative="1">
+      <w:start w:val="1"/>
+      <w:numFmt w:val="bullet"/>
+      <w:lvlText w:val=""/>
+      <w:lvlJc w:val="left"/>
+      <w:pPr>
+        <w:tabs>
+          <w:tab w:val="num" w:pos="2880"/>
+        </w:tabs>
+        <w:ind w:left="2880" w:hanging="360"/>
+      </w:pPr>
+      <w:rPr>
+        <w:rFonts w:ascii="Wingdings" w:hAnsi="Wingdings" w:hint="default"/>
+        <w:sz w:val="20"/>
+      </w:rPr>
+    </w:lvl>
+    <w:lvl w:ilvl="4" w:tentative="1">
+      <w:start w:val="1"/>
+      <w:numFmt w:val="bullet"/>
+      <w:lvlText w:val=""/>
+      <w:lvlJc w:val="left"/>
+      <w:pPr>
+        <w:tabs>
+          <w:tab w:val="num" w:pos="3600"/>
+        </w:tabs>
+        <w:ind w:left="3600" w:hanging="360"/>
+      </w:pPr>
+      <w:rPr>
+        <w:rFonts w:ascii="Wingdings" w:hAnsi="Wingdings" w:hint="default"/>
+        <w:sz w:val="20"/>
+      </w:rPr>
+    </w:lvl>
+    <w:lvl w:ilvl="5" w:tentative="1">
+      <w:start w:val="1"/>
+      <w:numFmt w:val="bullet"/>
+      <w:lvlText w:val=""/>
+      <w:lvlJc w:val="left"/>
+      <w:pPr>
+        <w:tabs>
+          <w:tab w:val="num" w:pos="4320"/>
+        </w:tabs>
+        <w:ind w:left="4320" w:hanging="360"/>
+      </w:pPr>
+      <w:rPr>
+        <w:rFonts w:ascii="Wingdings" w:hAnsi="Wingdings" w:hint="default"/>
+        <w:sz w:val="20"/>
+      </w:rPr>
+    </w:lvl>
+    <w:lvl w:ilvl="6" w:tentative="1">
+      <w:start w:val="1"/>
+      <w:numFmt w:val="bullet"/>
+      <w:lvlText w:val=""/>
+      <w:lvlJc w:val="left"/>
+      <w:pPr>
+        <w:tabs>
+          <w:tab w:val="num" w:pos="5040"/>
+        </w:tabs>
+        <w:ind w:left="5040" w:hanging="360"/>
+      </w:pPr>
+      <w:rPr>
+        <w:rFonts w:ascii="Wingdings" w:hAnsi="Wingdings" w:hint="default"/>
+        <w:sz w:val="20"/>
+      </w:rPr>
+    </w:lvl>
+    <w:lvl w:ilvl="7" w:tentative="1">
+      <w:start w:val="1"/>
+      <w:numFmt w:val="bullet"/>
+      <w:lvlText w:val=""/>
+      <w:lvlJc w:val="left"/>
+      <w:pPr>
+        <w:tabs>
+          <w:tab w:val="num" w:pos="5760"/>
+        </w:tabs>
+        <w:ind w:left="5760" w:hanging="360"/>
+      </w:pPr>
+      <w:rPr>
+        <w:rFonts w:ascii="Wingdings" w:hAnsi="Wingdings" w:hint="default"/>
+        <w:sz w:val="20"/>
+      </w:rPr>
+    </w:lvl>
+    <w:lvl w:ilvl="8" w:tentative="1">
+      <w:start w:val="1"/>
+      <w:numFmt w:val="bullet"/>
+      <w:lvlText w:val=""/>
+      <w:lvlJc w:val="left"/>
+      <w:pPr>
+        <w:tabs>
+          <w:tab w:val="num" w:pos="6480"/>
+        </w:tabs>
+        <w:ind w:left="6480" w:hanging="360"/>
+      </w:pPr>
+      <w:rPr>
+        <w:rFonts w:ascii="Wingdings" w:hAnsi="Wingdings" w:hint="default"/>
+        <w:sz w:val="20"/>
+      </w:rPr>
+    </w:lvl>
+  </w:abstractNum>
+  <w:abstractNum w:abstractNumId="4" w15:restartNumberingAfterBreak="0">
     <w:nsid w:val="288D738D"/>
     <w:multiLevelType w:val="multilevel"/>
     <w:tmpl w:val="517ED7C4"/>
@@ -2518,7 +4795,7 @@
       </w:pPr>
     </w:lvl>
   </w:abstractNum>
-  <w:abstractNum w:abstractNumId="2" w15:restartNumberingAfterBreak="0">
+  <w:abstractNum w:abstractNumId="5" w15:restartNumberingAfterBreak="0">
     <w:nsid w:val="2F574BD4"/>
     <w:multiLevelType w:val="multilevel"/>
     <w:tmpl w:val="68E6A3FA"/>
@@ -2667,7 +4944,7 @@
       </w:rPr>
     </w:lvl>
   </w:abstractNum>
-  <w:abstractNum w:abstractNumId="3" w15:restartNumberingAfterBreak="0">
+  <w:abstractNum w:abstractNumId="6" w15:restartNumberingAfterBreak="0">
     <w:nsid w:val="312A4894"/>
     <w:multiLevelType w:val="multilevel"/>
     <w:tmpl w:val="68E6A3FA"/>
@@ -2816,7 +5093,156 @@
       </w:rPr>
     </w:lvl>
   </w:abstractNum>
-  <w:abstractNum w:abstractNumId="4" w15:restartNumberingAfterBreak="0">
+  <w:abstractNum w:abstractNumId="7" w15:restartNumberingAfterBreak="0">
+    <w:nsid w:val="33C83578"/>
+    <w:multiLevelType w:val="multilevel"/>
+    <w:tmpl w:val="086ED87A"/>
+    <w:lvl w:ilvl="0">
+      <w:start w:val="1"/>
+      <w:numFmt w:val="bullet"/>
+      <w:lvlText w:val=""/>
+      <w:lvlJc w:val="left"/>
+      <w:pPr>
+        <w:tabs>
+          <w:tab w:val="num" w:pos="720"/>
+        </w:tabs>
+        <w:ind w:left="720" w:hanging="360"/>
+      </w:pPr>
+      <w:rPr>
+        <w:rFonts w:ascii="Symbol" w:hAnsi="Symbol" w:hint="default"/>
+        <w:sz w:val="20"/>
+      </w:rPr>
+    </w:lvl>
+    <w:lvl w:ilvl="1" w:tentative="1">
+      <w:start w:val="1"/>
+      <w:numFmt w:val="bullet"/>
+      <w:lvlText w:val="o"/>
+      <w:lvlJc w:val="left"/>
+      <w:pPr>
+        <w:tabs>
+          <w:tab w:val="num" w:pos="1440"/>
+        </w:tabs>
+        <w:ind w:left="1440" w:hanging="360"/>
+      </w:pPr>
+      <w:rPr>
+        <w:rFonts w:ascii="Courier New" w:hAnsi="Courier New" w:hint="default"/>
+        <w:sz w:val="20"/>
+      </w:rPr>
+    </w:lvl>
+    <w:lvl w:ilvl="2" w:tentative="1">
+      <w:start w:val="1"/>
+      <w:numFmt w:val="bullet"/>
+      <w:lvlText w:val=""/>
+      <w:lvlJc w:val="left"/>
+      <w:pPr>
+        <w:tabs>
+          <w:tab w:val="num" w:pos="2160"/>
+        </w:tabs>
+        <w:ind w:left="2160" w:hanging="360"/>
+      </w:pPr>
+      <w:rPr>
+        <w:rFonts w:ascii="Wingdings" w:hAnsi="Wingdings" w:hint="default"/>
+        <w:sz w:val="20"/>
+      </w:rPr>
+    </w:lvl>
+    <w:lvl w:ilvl="3" w:tentative="1">
+      <w:start w:val="1"/>
+      <w:numFmt w:val="bullet"/>
+      <w:lvlText w:val=""/>
+      <w:lvlJc w:val="left"/>
+      <w:pPr>
+        <w:tabs>
+          <w:tab w:val="num" w:pos="2880"/>
+        </w:tabs>
+        <w:ind w:left="2880" w:hanging="360"/>
+      </w:pPr>
+      <w:rPr>
+        <w:rFonts w:ascii="Wingdings" w:hAnsi="Wingdings" w:hint="default"/>
+        <w:sz w:val="20"/>
+      </w:rPr>
+    </w:lvl>
+    <w:lvl w:ilvl="4" w:tentative="1">
+      <w:start w:val="1"/>
+      <w:numFmt w:val="bullet"/>
+      <w:lvlText w:val=""/>
+      <w:lvlJc w:val="left"/>
+      <w:pPr>
+        <w:tabs>
+          <w:tab w:val="num" w:pos="3600"/>
+        </w:tabs>
+        <w:ind w:left="3600" w:hanging="360"/>
+      </w:pPr>
+      <w:rPr>
+        <w:rFonts w:ascii="Wingdings" w:hAnsi="Wingdings" w:hint="default"/>
+        <w:sz w:val="20"/>
+      </w:rPr>
+    </w:lvl>
+    <w:lvl w:ilvl="5" w:tentative="1">
+      <w:start w:val="1"/>
+      <w:numFmt w:val="bullet"/>
+      <w:lvlText w:val=""/>
+      <w:lvlJc w:val="left"/>
+      <w:pPr>
+        <w:tabs>
+          <w:tab w:val="num" w:pos="4320"/>
+        </w:tabs>
+        <w:ind w:left="4320" w:hanging="360"/>
+      </w:pPr>
+      <w:rPr>
+        <w:rFonts w:ascii="Wingdings" w:hAnsi="Wingdings" w:hint="default"/>
+        <w:sz w:val="20"/>
+      </w:rPr>
+    </w:lvl>
+    <w:lvl w:ilvl="6" w:tentative="1">
+      <w:start w:val="1"/>
+      <w:numFmt w:val="bullet"/>
+      <w:lvlText w:val=""/>
+      <w:lvlJc w:val="left"/>
+      <w:pPr>
+        <w:tabs>
+          <w:tab w:val="num" w:pos="5040"/>
+        </w:tabs>
+        <w:ind w:left="5040" w:hanging="360"/>
+      </w:pPr>
+      <w:rPr>
+        <w:rFonts w:ascii="Wingdings" w:hAnsi="Wingdings" w:hint="default"/>
+        <w:sz w:val="20"/>
+      </w:rPr>
+    </w:lvl>
+    <w:lvl w:ilvl="7" w:tentative="1">
+      <w:start w:val="1"/>
+      <w:numFmt w:val="bullet"/>
+      <w:lvlText w:val=""/>
+      <w:lvlJc w:val="left"/>
+      <w:pPr>
+        <w:tabs>
+          <w:tab w:val="num" w:pos="5760"/>
+        </w:tabs>
+        <w:ind w:left="5760" w:hanging="360"/>
+      </w:pPr>
+      <w:rPr>
+        <w:rFonts w:ascii="Wingdings" w:hAnsi="Wingdings" w:hint="default"/>
+        <w:sz w:val="20"/>
+      </w:rPr>
+    </w:lvl>
+    <w:lvl w:ilvl="8" w:tentative="1">
+      <w:start w:val="1"/>
+      <w:numFmt w:val="bullet"/>
+      <w:lvlText w:val=""/>
+      <w:lvlJc w:val="left"/>
+      <w:pPr>
+        <w:tabs>
+          <w:tab w:val="num" w:pos="6480"/>
+        </w:tabs>
+        <w:ind w:left="6480" w:hanging="360"/>
+      </w:pPr>
+      <w:rPr>
+        <w:rFonts w:ascii="Wingdings" w:hAnsi="Wingdings" w:hint="default"/>
+        <w:sz w:val="20"/>
+      </w:rPr>
+    </w:lvl>
+  </w:abstractNum>
+  <w:abstractNum w:abstractNumId="8" w15:restartNumberingAfterBreak="0">
     <w:nsid w:val="3A5F19F0"/>
     <w:multiLevelType w:val="multilevel"/>
     <w:tmpl w:val="68E6A3FA"/>
@@ -2965,7 +5391,7 @@
       </w:rPr>
     </w:lvl>
   </w:abstractNum>
-  <w:abstractNum w:abstractNumId="5" w15:restartNumberingAfterBreak="0">
+  <w:abstractNum w:abstractNumId="9" w15:restartNumberingAfterBreak="0">
     <w:nsid w:val="478575B9"/>
     <w:multiLevelType w:val="multilevel"/>
     <w:tmpl w:val="68E6A3FA"/>
@@ -3114,7 +5540,7 @@
       </w:rPr>
     </w:lvl>
   </w:abstractNum>
-  <w:abstractNum w:abstractNumId="6" w15:restartNumberingAfterBreak="0">
+  <w:abstractNum w:abstractNumId="10" w15:restartNumberingAfterBreak="0">
     <w:nsid w:val="4E2E1343"/>
     <w:multiLevelType w:val="multilevel"/>
     <w:tmpl w:val="68E6A3FA"/>
@@ -3263,7 +5689,7 @@
       </w:rPr>
     </w:lvl>
   </w:abstractNum>
-  <w:abstractNum w:abstractNumId="7" w15:restartNumberingAfterBreak="0">
+  <w:abstractNum w:abstractNumId="11" w15:restartNumberingAfterBreak="0">
     <w:nsid w:val="51C659D5"/>
     <w:multiLevelType w:val="multilevel"/>
     <w:tmpl w:val="68E6A3FA"/>
@@ -3412,7 +5838,305 @@
       </w:rPr>
     </w:lvl>
   </w:abstractNum>
-  <w:abstractNum w:abstractNumId="8" w15:restartNumberingAfterBreak="0">
+  <w:abstractNum w:abstractNumId="12" w15:restartNumberingAfterBreak="0">
+    <w:nsid w:val="5AB80A0D"/>
+    <w:multiLevelType w:val="multilevel"/>
+    <w:tmpl w:val="708E7D60"/>
+    <w:lvl w:ilvl="0">
+      <w:start w:val="1"/>
+      <w:numFmt w:val="bullet"/>
+      <w:lvlText w:val=""/>
+      <w:lvlJc w:val="left"/>
+      <w:pPr>
+        <w:tabs>
+          <w:tab w:val="num" w:pos="720"/>
+        </w:tabs>
+        <w:ind w:left="720" w:hanging="360"/>
+      </w:pPr>
+      <w:rPr>
+        <w:rFonts w:ascii="Symbol" w:hAnsi="Symbol" w:hint="default"/>
+        <w:sz w:val="20"/>
+      </w:rPr>
+    </w:lvl>
+    <w:lvl w:ilvl="1" w:tentative="1">
+      <w:start w:val="1"/>
+      <w:numFmt w:val="bullet"/>
+      <w:lvlText w:val="o"/>
+      <w:lvlJc w:val="left"/>
+      <w:pPr>
+        <w:tabs>
+          <w:tab w:val="num" w:pos="1440"/>
+        </w:tabs>
+        <w:ind w:left="1440" w:hanging="360"/>
+      </w:pPr>
+      <w:rPr>
+        <w:rFonts w:ascii="Courier New" w:hAnsi="Courier New" w:hint="default"/>
+        <w:sz w:val="20"/>
+      </w:rPr>
+    </w:lvl>
+    <w:lvl w:ilvl="2" w:tentative="1">
+      <w:start w:val="1"/>
+      <w:numFmt w:val="bullet"/>
+      <w:lvlText w:val=""/>
+      <w:lvlJc w:val="left"/>
+      <w:pPr>
+        <w:tabs>
+          <w:tab w:val="num" w:pos="2160"/>
+        </w:tabs>
+        <w:ind w:left="2160" w:hanging="360"/>
+      </w:pPr>
+      <w:rPr>
+        <w:rFonts w:ascii="Wingdings" w:hAnsi="Wingdings" w:hint="default"/>
+        <w:sz w:val="20"/>
+      </w:rPr>
+    </w:lvl>
+    <w:lvl w:ilvl="3" w:tentative="1">
+      <w:start w:val="1"/>
+      <w:numFmt w:val="bullet"/>
+      <w:lvlText w:val=""/>
+      <w:lvlJc w:val="left"/>
+      <w:pPr>
+        <w:tabs>
+          <w:tab w:val="num" w:pos="2880"/>
+        </w:tabs>
+        <w:ind w:left="2880" w:hanging="360"/>
+      </w:pPr>
+      <w:rPr>
+        <w:rFonts w:ascii="Wingdings" w:hAnsi="Wingdings" w:hint="default"/>
+        <w:sz w:val="20"/>
+      </w:rPr>
+    </w:lvl>
+    <w:lvl w:ilvl="4" w:tentative="1">
+      <w:start w:val="1"/>
+      <w:numFmt w:val="bullet"/>
+      <w:lvlText w:val=""/>
+      <w:lvlJc w:val="left"/>
+      <w:pPr>
+        <w:tabs>
+          <w:tab w:val="num" w:pos="3600"/>
+        </w:tabs>
+        <w:ind w:left="3600" w:hanging="360"/>
+      </w:pPr>
+      <w:rPr>
+        <w:rFonts w:ascii="Wingdings" w:hAnsi="Wingdings" w:hint="default"/>
+        <w:sz w:val="20"/>
+      </w:rPr>
+    </w:lvl>
+    <w:lvl w:ilvl="5" w:tentative="1">
+      <w:start w:val="1"/>
+      <w:numFmt w:val="bullet"/>
+      <w:lvlText w:val=""/>
+      <w:lvlJc w:val="left"/>
+      <w:pPr>
+        <w:tabs>
+          <w:tab w:val="num" w:pos="4320"/>
+        </w:tabs>
+        <w:ind w:left="4320" w:hanging="360"/>
+      </w:pPr>
+      <w:rPr>
+        <w:rFonts w:ascii="Wingdings" w:hAnsi="Wingdings" w:hint="default"/>
+        <w:sz w:val="20"/>
+      </w:rPr>
+    </w:lvl>
+    <w:lvl w:ilvl="6" w:tentative="1">
+      <w:start w:val="1"/>
+      <w:numFmt w:val="bullet"/>
+      <w:lvlText w:val=""/>
+      <w:lvlJc w:val="left"/>
+      <w:pPr>
+        <w:tabs>
+          <w:tab w:val="num" w:pos="5040"/>
+        </w:tabs>
+        <w:ind w:left="5040" w:hanging="360"/>
+      </w:pPr>
+      <w:rPr>
+        <w:rFonts w:ascii="Wingdings" w:hAnsi="Wingdings" w:hint="default"/>
+        <w:sz w:val="20"/>
+      </w:rPr>
+    </w:lvl>
+    <w:lvl w:ilvl="7" w:tentative="1">
+      <w:start w:val="1"/>
+      <w:numFmt w:val="bullet"/>
+      <w:lvlText w:val=""/>
+      <w:lvlJc w:val="left"/>
+      <w:pPr>
+        <w:tabs>
+          <w:tab w:val="num" w:pos="5760"/>
+        </w:tabs>
+        <w:ind w:left="5760" w:hanging="360"/>
+      </w:pPr>
+      <w:rPr>
+        <w:rFonts w:ascii="Wingdings" w:hAnsi="Wingdings" w:hint="default"/>
+        <w:sz w:val="20"/>
+      </w:rPr>
+    </w:lvl>
+    <w:lvl w:ilvl="8" w:tentative="1">
+      <w:start w:val="1"/>
+      <w:numFmt w:val="bullet"/>
+      <w:lvlText w:val=""/>
+      <w:lvlJc w:val="left"/>
+      <w:pPr>
+        <w:tabs>
+          <w:tab w:val="num" w:pos="6480"/>
+        </w:tabs>
+        <w:ind w:left="6480" w:hanging="360"/>
+      </w:pPr>
+      <w:rPr>
+        <w:rFonts w:ascii="Wingdings" w:hAnsi="Wingdings" w:hint="default"/>
+        <w:sz w:val="20"/>
+      </w:rPr>
+    </w:lvl>
+  </w:abstractNum>
+  <w:abstractNum w:abstractNumId="13" w15:restartNumberingAfterBreak="0">
+    <w:nsid w:val="69A10CED"/>
+    <w:multiLevelType w:val="multilevel"/>
+    <w:tmpl w:val="1068D88A"/>
+    <w:lvl w:ilvl="0">
+      <w:start w:val="1"/>
+      <w:numFmt w:val="bullet"/>
+      <w:lvlText w:val=""/>
+      <w:lvlJc w:val="left"/>
+      <w:pPr>
+        <w:tabs>
+          <w:tab w:val="num" w:pos="720"/>
+        </w:tabs>
+        <w:ind w:left="720" w:hanging="360"/>
+      </w:pPr>
+      <w:rPr>
+        <w:rFonts w:ascii="Symbol" w:hAnsi="Symbol" w:hint="default"/>
+        <w:sz w:val="20"/>
+      </w:rPr>
+    </w:lvl>
+    <w:lvl w:ilvl="1" w:tentative="1">
+      <w:start w:val="1"/>
+      <w:numFmt w:val="bullet"/>
+      <w:lvlText w:val="o"/>
+      <w:lvlJc w:val="left"/>
+      <w:pPr>
+        <w:tabs>
+          <w:tab w:val="num" w:pos="1440"/>
+        </w:tabs>
+        <w:ind w:left="1440" w:hanging="360"/>
+      </w:pPr>
+      <w:rPr>
+        <w:rFonts w:ascii="Courier New" w:hAnsi="Courier New" w:hint="default"/>
+        <w:sz w:val="20"/>
+      </w:rPr>
+    </w:lvl>
+    <w:lvl w:ilvl="2" w:tentative="1">
+      <w:start w:val="1"/>
+      <w:numFmt w:val="bullet"/>
+      <w:lvlText w:val=""/>
+      <w:lvlJc w:val="left"/>
+      <w:pPr>
+        <w:tabs>
+          <w:tab w:val="num" w:pos="2160"/>
+        </w:tabs>
+        <w:ind w:left="2160" w:hanging="360"/>
+      </w:pPr>
+      <w:rPr>
+        <w:rFonts w:ascii="Wingdings" w:hAnsi="Wingdings" w:hint="default"/>
+        <w:sz w:val="20"/>
+      </w:rPr>
+    </w:lvl>
+    <w:lvl w:ilvl="3" w:tentative="1">
+      <w:start w:val="1"/>
+      <w:numFmt w:val="bullet"/>
+      <w:lvlText w:val=""/>
+      <w:lvlJc w:val="left"/>
+      <w:pPr>
+        <w:tabs>
+          <w:tab w:val="num" w:pos="2880"/>
+        </w:tabs>
+        <w:ind w:left="2880" w:hanging="360"/>
+      </w:pPr>
+      <w:rPr>
+        <w:rFonts w:ascii="Wingdings" w:hAnsi="Wingdings" w:hint="default"/>
+        <w:sz w:val="20"/>
+      </w:rPr>
+    </w:lvl>
+    <w:lvl w:ilvl="4" w:tentative="1">
+      <w:start w:val="1"/>
+      <w:numFmt w:val="bullet"/>
+      <w:lvlText w:val=""/>
+      <w:lvlJc w:val="left"/>
+      <w:pPr>
+        <w:tabs>
+          <w:tab w:val="num" w:pos="3600"/>
+        </w:tabs>
+        <w:ind w:left="3600" w:hanging="360"/>
+      </w:pPr>
+      <w:rPr>
+        <w:rFonts w:ascii="Wingdings" w:hAnsi="Wingdings" w:hint="default"/>
+        <w:sz w:val="20"/>
+      </w:rPr>
+    </w:lvl>
+    <w:lvl w:ilvl="5" w:tentative="1">
+      <w:start w:val="1"/>
+      <w:numFmt w:val="bullet"/>
+      <w:lvlText w:val=""/>
+      <w:lvlJc w:val="left"/>
+      <w:pPr>
+        <w:tabs>
+          <w:tab w:val="num" w:pos="4320"/>
+        </w:tabs>
+        <w:ind w:left="4320" w:hanging="360"/>
+      </w:pPr>
+      <w:rPr>
+        <w:rFonts w:ascii="Wingdings" w:hAnsi="Wingdings" w:hint="default"/>
+        <w:sz w:val="20"/>
+      </w:rPr>
+    </w:lvl>
+    <w:lvl w:ilvl="6" w:tentative="1">
+      <w:start w:val="1"/>
+      <w:numFmt w:val="bullet"/>
+      <w:lvlText w:val=""/>
+      <w:lvlJc w:val="left"/>
+      <w:pPr>
+        <w:tabs>
+          <w:tab w:val="num" w:pos="5040"/>
+        </w:tabs>
+        <w:ind w:left="5040" w:hanging="360"/>
+      </w:pPr>
+      <w:rPr>
+        <w:rFonts w:ascii="Wingdings" w:hAnsi="Wingdings" w:hint="default"/>
+        <w:sz w:val="20"/>
+      </w:rPr>
+    </w:lvl>
+    <w:lvl w:ilvl="7" w:tentative="1">
+      <w:start w:val="1"/>
+      <w:numFmt w:val="bullet"/>
+      <w:lvlText w:val=""/>
+      <w:lvlJc w:val="left"/>
+      <w:pPr>
+        <w:tabs>
+          <w:tab w:val="num" w:pos="5760"/>
+        </w:tabs>
+        <w:ind w:left="5760" w:hanging="360"/>
+      </w:pPr>
+      <w:rPr>
+        <w:rFonts w:ascii="Wingdings" w:hAnsi="Wingdings" w:hint="default"/>
+        <w:sz w:val="20"/>
+      </w:rPr>
+    </w:lvl>
+    <w:lvl w:ilvl="8" w:tentative="1">
+      <w:start w:val="1"/>
+      <w:numFmt w:val="bullet"/>
+      <w:lvlText w:val=""/>
+      <w:lvlJc w:val="left"/>
+      <w:pPr>
+        <w:tabs>
+          <w:tab w:val="num" w:pos="6480"/>
+        </w:tabs>
+        <w:ind w:left="6480" w:hanging="360"/>
+      </w:pPr>
+      <w:rPr>
+        <w:rFonts w:ascii="Wingdings" w:hAnsi="Wingdings" w:hint="default"/>
+        <w:sz w:val="20"/>
+      </w:rPr>
+    </w:lvl>
+  </w:abstractNum>
+  <w:abstractNum w:abstractNumId="14" w15:restartNumberingAfterBreak="0">
     <w:nsid w:val="69F41141"/>
     <w:multiLevelType w:val="multilevel"/>
     <w:tmpl w:val="68E6A3FA"/>
@@ -3561,7 +6285,7 @@
       </w:rPr>
     </w:lvl>
   </w:abstractNum>
-  <w:abstractNum w:abstractNumId="9" w15:restartNumberingAfterBreak="0">
+  <w:abstractNum w:abstractNumId="15" w15:restartNumberingAfterBreak="0">
     <w:nsid w:val="6E4A5F8B"/>
     <w:multiLevelType w:val="multilevel"/>
     <w:tmpl w:val="68E6A3FA"/>
@@ -3710,7 +6434,305 @@
       </w:rPr>
     </w:lvl>
   </w:abstractNum>
-  <w:abstractNum w:abstractNumId="10" w15:restartNumberingAfterBreak="0">
+  <w:abstractNum w:abstractNumId="16" w15:restartNumberingAfterBreak="0">
+    <w:nsid w:val="71836DA2"/>
+    <w:multiLevelType w:val="multilevel"/>
+    <w:tmpl w:val="82B25628"/>
+    <w:lvl w:ilvl="0">
+      <w:start w:val="1"/>
+      <w:numFmt w:val="bullet"/>
+      <w:lvlText w:val=""/>
+      <w:lvlJc w:val="left"/>
+      <w:pPr>
+        <w:tabs>
+          <w:tab w:val="num" w:pos="720"/>
+        </w:tabs>
+        <w:ind w:left="720" w:hanging="360"/>
+      </w:pPr>
+      <w:rPr>
+        <w:rFonts w:ascii="Symbol" w:hAnsi="Symbol" w:hint="default"/>
+        <w:sz w:val="20"/>
+      </w:rPr>
+    </w:lvl>
+    <w:lvl w:ilvl="1" w:tentative="1">
+      <w:start w:val="1"/>
+      <w:numFmt w:val="bullet"/>
+      <w:lvlText w:val="o"/>
+      <w:lvlJc w:val="left"/>
+      <w:pPr>
+        <w:tabs>
+          <w:tab w:val="num" w:pos="1440"/>
+        </w:tabs>
+        <w:ind w:left="1440" w:hanging="360"/>
+      </w:pPr>
+      <w:rPr>
+        <w:rFonts w:ascii="Courier New" w:hAnsi="Courier New" w:hint="default"/>
+        <w:sz w:val="20"/>
+      </w:rPr>
+    </w:lvl>
+    <w:lvl w:ilvl="2" w:tentative="1">
+      <w:start w:val="1"/>
+      <w:numFmt w:val="bullet"/>
+      <w:lvlText w:val=""/>
+      <w:lvlJc w:val="left"/>
+      <w:pPr>
+        <w:tabs>
+          <w:tab w:val="num" w:pos="2160"/>
+        </w:tabs>
+        <w:ind w:left="2160" w:hanging="360"/>
+      </w:pPr>
+      <w:rPr>
+        <w:rFonts w:ascii="Wingdings" w:hAnsi="Wingdings" w:hint="default"/>
+        <w:sz w:val="20"/>
+      </w:rPr>
+    </w:lvl>
+    <w:lvl w:ilvl="3" w:tentative="1">
+      <w:start w:val="1"/>
+      <w:numFmt w:val="bullet"/>
+      <w:lvlText w:val=""/>
+      <w:lvlJc w:val="left"/>
+      <w:pPr>
+        <w:tabs>
+          <w:tab w:val="num" w:pos="2880"/>
+        </w:tabs>
+        <w:ind w:left="2880" w:hanging="360"/>
+      </w:pPr>
+      <w:rPr>
+        <w:rFonts w:ascii="Wingdings" w:hAnsi="Wingdings" w:hint="default"/>
+        <w:sz w:val="20"/>
+      </w:rPr>
+    </w:lvl>
+    <w:lvl w:ilvl="4" w:tentative="1">
+      <w:start w:val="1"/>
+      <w:numFmt w:val="bullet"/>
+      <w:lvlText w:val=""/>
+      <w:lvlJc w:val="left"/>
+      <w:pPr>
+        <w:tabs>
+          <w:tab w:val="num" w:pos="3600"/>
+        </w:tabs>
+        <w:ind w:left="3600" w:hanging="360"/>
+      </w:pPr>
+      <w:rPr>
+        <w:rFonts w:ascii="Wingdings" w:hAnsi="Wingdings" w:hint="default"/>
+        <w:sz w:val="20"/>
+      </w:rPr>
+    </w:lvl>
+    <w:lvl w:ilvl="5" w:tentative="1">
+      <w:start w:val="1"/>
+      <w:numFmt w:val="bullet"/>
+      <w:lvlText w:val=""/>
+      <w:lvlJc w:val="left"/>
+      <w:pPr>
+        <w:tabs>
+          <w:tab w:val="num" w:pos="4320"/>
+        </w:tabs>
+        <w:ind w:left="4320" w:hanging="360"/>
+      </w:pPr>
+      <w:rPr>
+        <w:rFonts w:ascii="Wingdings" w:hAnsi="Wingdings" w:hint="default"/>
+        <w:sz w:val="20"/>
+      </w:rPr>
+    </w:lvl>
+    <w:lvl w:ilvl="6" w:tentative="1">
+      <w:start w:val="1"/>
+      <w:numFmt w:val="bullet"/>
+      <w:lvlText w:val=""/>
+      <w:lvlJc w:val="left"/>
+      <w:pPr>
+        <w:tabs>
+          <w:tab w:val="num" w:pos="5040"/>
+        </w:tabs>
+        <w:ind w:left="5040" w:hanging="360"/>
+      </w:pPr>
+      <w:rPr>
+        <w:rFonts w:ascii="Wingdings" w:hAnsi="Wingdings" w:hint="default"/>
+        <w:sz w:val="20"/>
+      </w:rPr>
+    </w:lvl>
+    <w:lvl w:ilvl="7" w:tentative="1">
+      <w:start w:val="1"/>
+      <w:numFmt w:val="bullet"/>
+      <w:lvlText w:val=""/>
+      <w:lvlJc w:val="left"/>
+      <w:pPr>
+        <w:tabs>
+          <w:tab w:val="num" w:pos="5760"/>
+        </w:tabs>
+        <w:ind w:left="5760" w:hanging="360"/>
+      </w:pPr>
+      <w:rPr>
+        <w:rFonts w:ascii="Wingdings" w:hAnsi="Wingdings" w:hint="default"/>
+        <w:sz w:val="20"/>
+      </w:rPr>
+    </w:lvl>
+    <w:lvl w:ilvl="8" w:tentative="1">
+      <w:start w:val="1"/>
+      <w:numFmt w:val="bullet"/>
+      <w:lvlText w:val=""/>
+      <w:lvlJc w:val="left"/>
+      <w:pPr>
+        <w:tabs>
+          <w:tab w:val="num" w:pos="6480"/>
+        </w:tabs>
+        <w:ind w:left="6480" w:hanging="360"/>
+      </w:pPr>
+      <w:rPr>
+        <w:rFonts w:ascii="Wingdings" w:hAnsi="Wingdings" w:hint="default"/>
+        <w:sz w:val="20"/>
+      </w:rPr>
+    </w:lvl>
+  </w:abstractNum>
+  <w:abstractNum w:abstractNumId="17" w15:restartNumberingAfterBreak="0">
+    <w:nsid w:val="72516E16"/>
+    <w:multiLevelType w:val="multilevel"/>
+    <w:tmpl w:val="3C7A7F9C"/>
+    <w:lvl w:ilvl="0">
+      <w:start w:val="1"/>
+      <w:numFmt w:val="bullet"/>
+      <w:lvlText w:val=""/>
+      <w:lvlJc w:val="left"/>
+      <w:pPr>
+        <w:tabs>
+          <w:tab w:val="num" w:pos="720"/>
+        </w:tabs>
+        <w:ind w:left="720" w:hanging="360"/>
+      </w:pPr>
+      <w:rPr>
+        <w:rFonts w:ascii="Symbol" w:hAnsi="Symbol" w:hint="default"/>
+        <w:sz w:val="20"/>
+      </w:rPr>
+    </w:lvl>
+    <w:lvl w:ilvl="1" w:tentative="1">
+      <w:start w:val="1"/>
+      <w:numFmt w:val="bullet"/>
+      <w:lvlText w:val="o"/>
+      <w:lvlJc w:val="left"/>
+      <w:pPr>
+        <w:tabs>
+          <w:tab w:val="num" w:pos="1440"/>
+        </w:tabs>
+        <w:ind w:left="1440" w:hanging="360"/>
+      </w:pPr>
+      <w:rPr>
+        <w:rFonts w:ascii="Courier New" w:hAnsi="Courier New" w:hint="default"/>
+        <w:sz w:val="20"/>
+      </w:rPr>
+    </w:lvl>
+    <w:lvl w:ilvl="2" w:tentative="1">
+      <w:start w:val="1"/>
+      <w:numFmt w:val="bullet"/>
+      <w:lvlText w:val=""/>
+      <w:lvlJc w:val="left"/>
+      <w:pPr>
+        <w:tabs>
+          <w:tab w:val="num" w:pos="2160"/>
+        </w:tabs>
+        <w:ind w:left="2160" w:hanging="360"/>
+      </w:pPr>
+      <w:rPr>
+        <w:rFonts w:ascii="Wingdings" w:hAnsi="Wingdings" w:hint="default"/>
+        <w:sz w:val="20"/>
+      </w:rPr>
+    </w:lvl>
+    <w:lvl w:ilvl="3" w:tentative="1">
+      <w:start w:val="1"/>
+      <w:numFmt w:val="bullet"/>
+      <w:lvlText w:val=""/>
+      <w:lvlJc w:val="left"/>
+      <w:pPr>
+        <w:tabs>
+          <w:tab w:val="num" w:pos="2880"/>
+        </w:tabs>
+        <w:ind w:left="2880" w:hanging="360"/>
+      </w:pPr>
+      <w:rPr>
+        <w:rFonts w:ascii="Wingdings" w:hAnsi="Wingdings" w:hint="default"/>
+        <w:sz w:val="20"/>
+      </w:rPr>
+    </w:lvl>
+    <w:lvl w:ilvl="4" w:tentative="1">
+      <w:start w:val="1"/>
+      <w:numFmt w:val="bullet"/>
+      <w:lvlText w:val=""/>
+      <w:lvlJc w:val="left"/>
+      <w:pPr>
+        <w:tabs>
+          <w:tab w:val="num" w:pos="3600"/>
+        </w:tabs>
+        <w:ind w:left="3600" w:hanging="360"/>
+      </w:pPr>
+      <w:rPr>
+        <w:rFonts w:ascii="Wingdings" w:hAnsi="Wingdings" w:hint="default"/>
+        <w:sz w:val="20"/>
+      </w:rPr>
+    </w:lvl>
+    <w:lvl w:ilvl="5" w:tentative="1">
+      <w:start w:val="1"/>
+      <w:numFmt w:val="bullet"/>
+      <w:lvlText w:val=""/>
+      <w:lvlJc w:val="left"/>
+      <w:pPr>
+        <w:tabs>
+          <w:tab w:val="num" w:pos="4320"/>
+        </w:tabs>
+        <w:ind w:left="4320" w:hanging="360"/>
+      </w:pPr>
+      <w:rPr>
+        <w:rFonts w:ascii="Wingdings" w:hAnsi="Wingdings" w:hint="default"/>
+        <w:sz w:val="20"/>
+      </w:rPr>
+    </w:lvl>
+    <w:lvl w:ilvl="6" w:tentative="1">
+      <w:start w:val="1"/>
+      <w:numFmt w:val="bullet"/>
+      <w:lvlText w:val=""/>
+      <w:lvlJc w:val="left"/>
+      <w:pPr>
+        <w:tabs>
+          <w:tab w:val="num" w:pos="5040"/>
+        </w:tabs>
+        <w:ind w:left="5040" w:hanging="360"/>
+      </w:pPr>
+      <w:rPr>
+        <w:rFonts w:ascii="Wingdings" w:hAnsi="Wingdings" w:hint="default"/>
+        <w:sz w:val="20"/>
+      </w:rPr>
+    </w:lvl>
+    <w:lvl w:ilvl="7" w:tentative="1">
+      <w:start w:val="1"/>
+      <w:numFmt w:val="bullet"/>
+      <w:lvlText w:val=""/>
+      <w:lvlJc w:val="left"/>
+      <w:pPr>
+        <w:tabs>
+          <w:tab w:val="num" w:pos="5760"/>
+        </w:tabs>
+        <w:ind w:left="5760" w:hanging="360"/>
+      </w:pPr>
+      <w:rPr>
+        <w:rFonts w:ascii="Wingdings" w:hAnsi="Wingdings" w:hint="default"/>
+        <w:sz w:val="20"/>
+      </w:rPr>
+    </w:lvl>
+    <w:lvl w:ilvl="8" w:tentative="1">
+      <w:start w:val="1"/>
+      <w:numFmt w:val="bullet"/>
+      <w:lvlText w:val=""/>
+      <w:lvlJc w:val="left"/>
+      <w:pPr>
+        <w:tabs>
+          <w:tab w:val="num" w:pos="6480"/>
+        </w:tabs>
+        <w:ind w:left="6480" w:hanging="360"/>
+      </w:pPr>
+      <w:rPr>
+        <w:rFonts w:ascii="Wingdings" w:hAnsi="Wingdings" w:hint="default"/>
+        <w:sz w:val="20"/>
+      </w:rPr>
+    </w:lvl>
+  </w:abstractNum>
+  <w:abstractNum w:abstractNumId="18" w15:restartNumberingAfterBreak="0">
     <w:nsid w:val="7D0742CB"/>
     <w:multiLevelType w:val="multilevel"/>
     <w:tmpl w:val="68E6A3FA"/>
@@ -3860,37 +6882,61 @@
     </w:lvl>
   </w:abstractNum>
   <w:num w:numId="1" w16cid:durableId="152255704">
+    <w:abstractNumId w:val="4"/>
+  </w:num>
+  <w:num w:numId="2" w16cid:durableId="455830702">
+    <w:abstractNumId w:val="9"/>
+  </w:num>
+  <w:num w:numId="3" w16cid:durableId="350643257">
     <w:abstractNumId w:val="1"/>
   </w:num>
-  <w:num w:numId="2" w16cid:durableId="455830702">
+  <w:num w:numId="4" w16cid:durableId="817840343">
+    <w:abstractNumId w:val="8"/>
+  </w:num>
+  <w:num w:numId="5" w16cid:durableId="749079191">
+    <w:abstractNumId w:val="6"/>
+  </w:num>
+  <w:num w:numId="6" w16cid:durableId="280429101">
+    <w:abstractNumId w:val="15"/>
+  </w:num>
+  <w:num w:numId="7" w16cid:durableId="423691328">
+    <w:abstractNumId w:val="10"/>
+  </w:num>
+  <w:num w:numId="8" w16cid:durableId="490413989">
+    <w:abstractNumId w:val="18"/>
+  </w:num>
+  <w:num w:numId="9" w16cid:durableId="921598837">
     <w:abstractNumId w:val="5"/>
   </w:num>
-  <w:num w:numId="3" w16cid:durableId="350643257">
+  <w:num w:numId="10" w16cid:durableId="577446429">
+    <w:abstractNumId w:val="14"/>
+  </w:num>
+  <w:num w:numId="11" w16cid:durableId="360210970">
+    <w:abstractNumId w:val="11"/>
+  </w:num>
+  <w:num w:numId="12" w16cid:durableId="469250249">
+    <w:abstractNumId w:val="12"/>
+  </w:num>
+  <w:num w:numId="13" w16cid:durableId="709384156">
+    <w:abstractNumId w:val="7"/>
+  </w:num>
+  <w:num w:numId="14" w16cid:durableId="1318731632">
+    <w:abstractNumId w:val="13"/>
+  </w:num>
+  <w:num w:numId="15" w16cid:durableId="250554771">
+    <w:abstractNumId w:val="17"/>
+  </w:num>
+  <w:num w:numId="16" w16cid:durableId="1748305860">
+    <w:abstractNumId w:val="16"/>
+  </w:num>
+  <w:num w:numId="17" w16cid:durableId="302660691">
+    <w:abstractNumId w:val="2"/>
+  </w:num>
+  <w:num w:numId="18" w16cid:durableId="823012793">
     <w:abstractNumId w:val="0"/>
   </w:num>
-  <w:num w:numId="4" w16cid:durableId="817840343">
-    <w:abstractNumId w:val="4"/>
-  </w:num>
-  <w:num w:numId="5" w16cid:durableId="749079191">
+  <w:num w:numId="19" w16cid:durableId="1401177733">
     <w:abstractNumId w:val="3"/>
-  </w:num>
-  <w:num w:numId="6" w16cid:durableId="280429101">
-    <w:abstractNumId w:val="9"/>
-  </w:num>
-  <w:num w:numId="7" w16cid:durableId="423691328">
-    <w:abstractNumId w:val="6"/>
-  </w:num>
-  <w:num w:numId="8" w16cid:durableId="490413989">
-    <w:abstractNumId w:val="10"/>
-  </w:num>
-  <w:num w:numId="9" w16cid:durableId="921598837">
-    <w:abstractNumId w:val="2"/>
-  </w:num>
-  <w:num w:numId="10" w16cid:durableId="577446429">
-    <w:abstractNumId w:val="8"/>
-  </w:num>
-  <w:num w:numId="11" w16cid:durableId="360210970">
-    <w:abstractNumId w:val="7"/>
   </w:num>
 </w:numbering>
 </file>

</xml_diff>